<commit_message>
Job Work Issue UI, Template and Grid.
</commit_message>
<xml_diff>
--- a/APLOS/POPResources/Templates/JWIssue202026.docx
+++ b/APLOS/POPResources/Templates/JWIssue202026.docx
@@ -72,13 +72,7 @@
                         <w:txbxContent>
                           <w:p>
                             <w:pPr>
-                              <w:rPr>
-                                <w:rFonts w:ascii="Tahoma" w:hAnsi="Tahoma" w:cs="Tahoma"/>
-                                <w:b/>
-                                <w:bCs/>
-                                <w:sz w:val="16"/>
-                                <w:szCs w:val="16"/>
-                              </w:rPr>
+                              <w:jc w:val="center"/>
                             </w:pPr>
                             <w:r>
                               <w:rPr>
@@ -89,13 +83,8 @@
                                 <w:szCs w:val="16"/>
                                 <w:shd w:val="clear" w:color="auto" w:fill="FFFFFF"/>
                               </w:rPr>
-                              <w:t>Odyssey Craft (Pvt.) Ltd.</w:t>
+                              <w:t>Vasudha Swaraj Pvt. Ltd.</w:t>
                             </w:r>
-                          </w:p>
-                          <w:p>
-                            <w:pPr>
-                              <w:jc w:val="center"/>
-                            </w:pPr>
                           </w:p>
                         </w:txbxContent>
                       </wps:txbx>
@@ -124,13 +113,7 @@
                   <w:txbxContent>
                     <w:p>
                       <w:pPr>
-                        <w:rPr>
-                          <w:rFonts w:ascii="Tahoma" w:hAnsi="Tahoma" w:cs="Tahoma"/>
-                          <w:b/>
-                          <w:bCs/>
-                          <w:sz w:val="16"/>
-                          <w:szCs w:val="16"/>
-                        </w:rPr>
+                        <w:jc w:val="center"/>
                       </w:pPr>
                       <w:r>
                         <w:rPr>
@@ -141,13 +124,8 @@
                           <w:szCs w:val="16"/>
                           <w:shd w:val="clear" w:color="auto" w:fill="FFFFFF"/>
                         </w:rPr>
-                        <w:t>Odyssey Craft (Pvt.) Ltd.</w:t>
+                        <w:t>Vasudha Swaraj Pvt. Ltd.</w:t>
                       </w:r>
-                    </w:p>
-                    <w:p>
-                      <w:pPr>
-                        <w:jc w:val="center"/>
-                      </w:pPr>
                     </w:p>
                   </w:txbxContent>
                 </v:textbox>
@@ -223,21 +201,8 @@
                                 <w:szCs w:val="20"/>
                                 <w:u w:val="single"/>
                               </w:rPr>
-                              <w:t xml:space="preserve">Transformation Job Work Material Issue </w:t>
+                              <w:t>Transformation Job Work Material Issue Chalaan</w:t>
                             </w:r>
-                            <w:proofErr w:type="spellStart"/>
-                            <w:r>
-                              <w:rPr>
-                                <w:rFonts w:ascii="Tahoma" w:hAnsi="Tahoma" w:cs="Tahoma"/>
-                                <w:b/>
-                                <w:bCs/>
-                                <w:sz w:val="20"/>
-                                <w:szCs w:val="20"/>
-                                <w:u w:val="single"/>
-                              </w:rPr>
-                              <w:t>Chalaan</w:t>
-                            </w:r>
-                            <w:proofErr w:type="spellEnd"/>
                           </w:p>
                         </w:txbxContent>
                       </wps:txbx>
@@ -283,21 +248,8 @@
                           <w:szCs w:val="20"/>
                           <w:u w:val="single"/>
                         </w:rPr>
-                        <w:t xml:space="preserve">Transformation Job Work Material Issue </w:t>
+                        <w:t>Transformation Job Work Material Issue Chalaan</w:t>
                       </w:r>
-                      <w:proofErr w:type="spellStart"/>
-                      <w:r>
-                        <w:rPr>
-                          <w:rFonts w:ascii="Tahoma" w:hAnsi="Tahoma" w:cs="Tahoma"/>
-                          <w:b/>
-                          <w:bCs/>
-                          <w:sz w:val="20"/>
-                          <w:szCs w:val="20"/>
-                          <w:u w:val="single"/>
-                        </w:rPr>
-                        <w:t>Chalaan</w:t>
-                      </w:r>
-                      <w:proofErr w:type="spellEnd"/>
                     </w:p>
                   </w:txbxContent>
                 </v:textbox>
@@ -366,7 +318,6 @@
               </w:rPr>
               <w:t>{</w:t>
             </w:r>
-            <w:proofErr w:type="spellStart"/>
             <w:r>
               <w:rPr>
                 <w:rFonts w:ascii="Tahoma" w:hAnsi="Tahoma" w:cs="Tahoma"/>
@@ -375,9 +326,8 @@
                 <w:szCs w:val="16"/>
                 <w:lang w:val="en-IN"/>
               </w:rPr>
-              <w:t>ValueAddedDate</w:t>
-            </w:r>
-            <w:proofErr w:type="spellEnd"/>
+              <w:t>TContractDate</w:t>
+            </w:r>
             <w:r>
               <w:rPr>
                 <w:rFonts w:ascii="Tahoma" w:eastAsia="Arial" w:hAnsi="Tahoma" w:cs="Tahoma"/>
@@ -403,7 +353,7 @@
                 <w:sz w:val="16"/>
                 <w:szCs w:val="16"/>
               </w:rPr>
-              <w:t xml:space="preserve">       </w:t>
+              <w:t xml:space="preserve">      </w:t>
             </w:r>
             <w:r>
               <w:rPr>
@@ -451,7 +401,7 @@
                 <w:szCs w:val="16"/>
                 <w:lang w:val="en-IN"/>
               </w:rPr>
-              <w:t>Entity</w:t>
+              <w:t>TConEntity</w:t>
             </w:r>
             <w:r>
               <w:rPr>
@@ -511,7 +461,6 @@
               </w:rPr>
               <w:t>{</w:t>
             </w:r>
-            <w:proofErr w:type="spellStart"/>
             <w:r>
               <w:rPr>
                 <w:rFonts w:ascii="Tahoma" w:hAnsi="Tahoma" w:cs="Tahoma"/>
@@ -520,9 +469,8 @@
                 <w:szCs w:val="16"/>
                 <w:lang w:val="en-IN"/>
               </w:rPr>
-              <w:t>VAProcessStartDate</w:t>
-            </w:r>
-            <w:proofErr w:type="spellEnd"/>
+              <w:t>TConProcessStartDate</w:t>
+            </w:r>
             <w:r>
               <w:rPr>
                 <w:rFonts w:ascii="Tahoma" w:hAnsi="Tahoma" w:cs="Tahoma"/>
@@ -539,27 +487,85 @@
                 <w:sz w:val="16"/>
                 <w:szCs w:val="16"/>
               </w:rPr>
-              <w:t xml:space="preserve">        </w:t>
-            </w:r>
-            <w:r>
-              <w:rPr>
-                <w:rFonts w:ascii="Tahoma" w:hAnsi="Tahoma" w:cs="Tahoma"/>
-                <w:color w:val="000000"/>
-                <w:sz w:val="16"/>
-                <w:szCs w:val="16"/>
-              </w:rPr>
               <w:t xml:space="preserve">       </w:t>
             </w:r>
             <w:r>
               <w:rPr>
                 <w:rFonts w:ascii="Tahoma" w:hAnsi="Tahoma" w:cs="Tahoma"/>
-                <w:b/>
-                <w:bCs/>
-                <w:color w:val="000000"/>
-                <w:sz w:val="16"/>
-                <w:szCs w:val="16"/>
-              </w:rPr>
-              <w:t>Process End Date</w:t>
+                <w:color w:val="000000"/>
+                <w:sz w:val="16"/>
+                <w:szCs w:val="16"/>
+              </w:rPr>
+              <w:t xml:space="preserve"> </w:t>
+            </w:r>
+            <w:r>
+              <w:rPr>
+                <w:rFonts w:ascii="Tahoma" w:hAnsi="Tahoma" w:cs="Tahoma"/>
+                <w:color w:val="000000"/>
+                <w:sz w:val="16"/>
+                <w:szCs w:val="16"/>
+              </w:rPr>
+              <w:t xml:space="preserve">    </w:t>
+            </w:r>
+            <w:r>
+              <w:rPr>
+                <w:rFonts w:ascii="Tahoma" w:hAnsi="Tahoma" w:cs="Tahoma"/>
+                <w:color w:val="000000"/>
+                <w:sz w:val="16"/>
+                <w:szCs w:val="16"/>
+              </w:rPr>
+              <w:t xml:space="preserve">     </w:t>
+            </w:r>
+            <w:r>
+              <w:rPr>
+                <w:rFonts w:ascii="Tahoma" w:hAnsi="Tahoma" w:cs="Tahoma"/>
+                <w:color w:val="000000"/>
+                <w:sz w:val="16"/>
+                <w:szCs w:val="16"/>
+              </w:rPr>
+              <w:t xml:space="preserve"> </w:t>
+            </w:r>
+            <w:r>
+              <w:rPr>
+                <w:rFonts w:ascii="Tahoma" w:hAnsi="Tahoma" w:cs="Tahoma"/>
+                <w:color w:val="000000"/>
+                <w:sz w:val="16"/>
+                <w:szCs w:val="16"/>
+              </w:rPr>
+              <w:t xml:space="preserve"> </w:t>
+            </w:r>
+            <w:r>
+              <w:rPr>
+                <w:rFonts w:ascii="Tahoma" w:hAnsi="Tahoma" w:cs="Tahoma"/>
+                <w:b/>
+                <w:bCs/>
+                <w:color w:val="000000"/>
+                <w:sz w:val="16"/>
+                <w:szCs w:val="16"/>
+              </w:rPr>
+              <w:t>Process End</w:t>
+            </w:r>
+            <w:r>
+              <w:rPr>
+                <w:rFonts w:ascii="Tahoma" w:hAnsi="Tahoma" w:cs="Tahoma"/>
+                <w:b/>
+                <w:bCs/>
+                <w:color w:val="000000"/>
+                <w:sz w:val="16"/>
+                <w:szCs w:val="16"/>
+              </w:rPr>
+              <w:t xml:space="preserve"> </w:t>
+            </w:r>
+            <w:r>
+              <w:rPr>
+                <w:rFonts w:ascii="Tahoma" w:hAnsi="Tahoma" w:cs="Tahoma"/>
+                <w:b/>
+                <w:bCs/>
+                <w:color w:val="000000"/>
+                <w:sz w:val="16"/>
+                <w:szCs w:val="16"/>
+              </w:rPr>
+              <w:t>Date</w:t>
             </w:r>
             <w:r>
               <w:rPr>
@@ -581,7 +587,6 @@
               </w:rPr>
               <w:t>{</w:t>
             </w:r>
-            <w:proofErr w:type="spellStart"/>
             <w:r>
               <w:rPr>
                 <w:rFonts w:ascii="Tahoma" w:hAnsi="Tahoma" w:cs="Tahoma"/>
@@ -590,9 +595,8 @@
                 <w:szCs w:val="16"/>
                 <w:lang w:val="en-IN"/>
               </w:rPr>
-              <w:t>VAProcessEndDate</w:t>
-            </w:r>
-            <w:proofErr w:type="spellEnd"/>
+              <w:t>TConProcessEndDate</w:t>
+            </w:r>
             <w:r>
               <w:rPr>
                 <w:rFonts w:ascii="Tahoma" w:hAnsi="Tahoma" w:cs="Tahoma"/>
@@ -659,7 +663,7 @@
                 <w:szCs w:val="16"/>
                 <w:lang w:val="en-IN"/>
               </w:rPr>
-              <w:t>VAContractClosingDate</w:t>
+              <w:t>TConContractClosingDate</w:t>
             </w:r>
             <w:r>
               <w:rPr>
@@ -677,11 +681,38 @@
                 <w:sz w:val="16"/>
                 <w:szCs w:val="16"/>
               </w:rPr>
+              <w:t xml:space="preserve">  </w:t>
+            </w:r>
+            <w:r>
+              <w:rPr>
+                <w:rFonts w:ascii="Tahoma" w:eastAsia="Arial" w:hAnsi="Tahoma" w:cs="Tahoma"/>
+                <w:bCs/>
+                <w:sz w:val="16"/>
+                <w:szCs w:val="16"/>
+              </w:rPr>
+              <w:t xml:space="preserve">      </w:t>
+            </w:r>
+            <w:r>
+              <w:rPr>
+                <w:rFonts w:ascii="Tahoma" w:eastAsia="Arial" w:hAnsi="Tahoma" w:cs="Tahoma"/>
+                <w:bCs/>
+                <w:sz w:val="16"/>
+                <w:szCs w:val="16"/>
+              </w:rPr>
               <w:t xml:space="preserve">     </w:t>
             </w:r>
             <w:r>
               <w:rPr>
                 <w:rFonts w:ascii="Tahoma" w:eastAsia="Arial" w:hAnsi="Tahoma" w:cs="Tahoma"/>
+                <w:bCs/>
+                <w:sz w:val="16"/>
+                <w:szCs w:val="16"/>
+              </w:rPr>
+              <w:t xml:space="preserve"> </w:t>
+            </w:r>
+            <w:r>
+              <w:rPr>
+                <w:rFonts w:ascii="Tahoma" w:eastAsia="Arial" w:hAnsi="Tahoma" w:cs="Tahoma"/>
                 <w:b/>
                 <w:sz w:val="16"/>
                 <w:szCs w:val="16"/>
@@ -714,7 +745,7 @@
                 <w:szCs w:val="16"/>
                 <w:lang w:val="en-IN"/>
               </w:rPr>
-              <w:t>Id</w:t>
+              <w:t>JWContractId</w:t>
             </w:r>
             <w:r>
               <w:rPr>
@@ -773,6 +804,15 @@
                 <w:szCs w:val="16"/>
               </w:rPr>
               <w:t>{</w:t>
+            </w:r>
+            <w:r>
+              <w:rPr>
+                <w:rFonts w:ascii="Tahoma" w:eastAsia="Arial" w:hAnsi="Tahoma" w:cs="Tahoma"/>
+                <w:bCs/>
+                <w:sz w:val="16"/>
+                <w:szCs w:val="16"/>
+              </w:rPr>
+              <w:t>TCon</w:t>
             </w:r>
             <w:r>
               <w:rPr>
@@ -847,7 +887,6 @@
               </w:rPr>
               <w:t>{</w:t>
             </w:r>
-            <w:proofErr w:type="spellStart"/>
             <w:r>
               <w:rPr>
                 <w:rFonts w:ascii="Tahoma" w:hAnsi="Tahoma" w:cs="Tahoma"/>
@@ -856,9 +895,8 @@
                 <w:szCs w:val="16"/>
                 <w:lang w:val="en-IN"/>
               </w:rPr>
-              <w:t>TransformationIssueId</w:t>
-            </w:r>
-            <w:proofErr w:type="spellEnd"/>
+              <w:t>IssueNo</w:t>
+            </w:r>
             <w:r>
               <w:rPr>
                 <w:rFonts w:ascii="Tahoma" w:eastAsia="Times New Roman" w:hAnsi="Tahoma" w:cs="Tahoma"/>
@@ -875,11 +913,20 @@
                 <w:sz w:val="16"/>
                 <w:szCs w:val="16"/>
               </w:rPr>
-              <w:t xml:space="preserve">     </w:t>
+              <w:t xml:space="preserve">    </w:t>
             </w:r>
             <w:r>
               <w:rPr>
                 <w:rFonts w:ascii="Tahoma" w:eastAsia="Times New Roman" w:hAnsi="Tahoma" w:cs="Tahoma"/>
+                <w:color w:val="000000"/>
+                <w:sz w:val="16"/>
+                <w:szCs w:val="16"/>
+              </w:rPr>
+              <w:t xml:space="preserve">      </w:t>
+            </w:r>
+            <w:r>
+              <w:rPr>
+                <w:rFonts w:ascii="Tahoma" w:eastAsia="Times New Roman" w:hAnsi="Tahoma" w:cs="Tahoma"/>
                 <w:b/>
                 <w:bCs/>
                 <w:color w:val="000000"/>
@@ -906,7 +953,6 @@
               </w:rPr>
               <w:t>:{</w:t>
             </w:r>
-            <w:proofErr w:type="spellStart"/>
             <w:r>
               <w:rPr>
                 <w:rFonts w:ascii="Tahoma" w:hAnsi="Tahoma" w:cs="Tahoma"/>
@@ -915,9 +961,8 @@
                 <w:szCs w:val="16"/>
                 <w:lang w:val="en-IN"/>
               </w:rPr>
-              <w:t>TransformationDate</w:t>
-            </w:r>
-            <w:proofErr w:type="spellEnd"/>
+              <w:t>PODate</w:t>
+            </w:r>
             <w:r>
               <w:rPr>
                 <w:rFonts w:ascii="Tahoma" w:eastAsia="Times New Roman" w:hAnsi="Tahoma" w:cs="Tahoma"/>
@@ -965,6 +1010,33 @@
             </w:r>
             <w:r>
               <w:rPr>
+                <w:rFonts w:ascii="Tahoma" w:eastAsia="Times New Roman" w:hAnsi="Tahoma" w:cs="Tahoma"/>
+                <w:color w:val="000000"/>
+                <w:sz w:val="16"/>
+                <w:szCs w:val="16"/>
+              </w:rPr>
+              <w:t xml:space="preserve">   </w:t>
+            </w:r>
+            <w:r>
+              <w:rPr>
+                <w:rFonts w:ascii="Tahoma" w:eastAsia="Times New Roman" w:hAnsi="Tahoma" w:cs="Tahoma"/>
+                <w:color w:val="000000"/>
+                <w:sz w:val="16"/>
+                <w:szCs w:val="16"/>
+              </w:rPr>
+              <w:t xml:space="preserve"> </w:t>
+            </w:r>
+            <w:r>
+              <w:rPr>
+                <w:rFonts w:ascii="Tahoma" w:eastAsia="Times New Roman" w:hAnsi="Tahoma" w:cs="Tahoma"/>
+                <w:color w:val="000000"/>
+                <w:sz w:val="16"/>
+                <w:szCs w:val="16"/>
+              </w:rPr>
+              <w:t xml:space="preserve"> </w:t>
+            </w:r>
+            <w:r>
+              <w:rPr>
                 <w:rFonts w:ascii="Tahoma" w:eastAsia="Arial" w:hAnsi="Tahoma" w:cs="Tahoma"/>
                 <w:b/>
                 <w:bCs/>
@@ -992,7 +1064,6 @@
               </w:rPr>
               <w:t>{</w:t>
             </w:r>
-            <w:proofErr w:type="spellStart"/>
             <w:r>
               <w:rPr>
                 <w:rFonts w:ascii="Tahoma" w:hAnsi="Tahoma" w:cs="Tahoma"/>
@@ -1003,7 +1074,6 @@
               </w:rPr>
               <w:t>PartyName</w:t>
             </w:r>
-            <w:proofErr w:type="spellEnd"/>
             <w:r>
               <w:rPr>
                 <w:rFonts w:ascii="Tahoma" w:eastAsia="Times New Roman" w:hAnsi="Tahoma" w:cs="Tahoma"/>
@@ -1070,7 +1140,6 @@
               </w:rPr>
               <w:t>{</w:t>
             </w:r>
-            <w:proofErr w:type="spellStart"/>
             <w:r>
               <w:rPr>
                 <w:rFonts w:ascii="Tahoma" w:hAnsi="Tahoma" w:cs="Tahoma"/>
@@ -1079,9 +1148,8 @@
                 <w:szCs w:val="16"/>
                 <w:lang w:val="en-IN"/>
               </w:rPr>
-              <w:t>ByWhom</w:t>
-            </w:r>
-            <w:proofErr w:type="spellEnd"/>
+              <w:t>EmployeeName</w:t>
+            </w:r>
             <w:r>
               <w:rPr>
                 <w:rFonts w:ascii="Tahoma" w:hAnsi="Tahoma" w:cs="Tahoma"/>
@@ -1099,17 +1167,27 @@
                 <w:sz w:val="16"/>
                 <w:szCs w:val="16"/>
               </w:rPr>
-              <w:t xml:space="preserve">                             </w:t>
-            </w:r>
-            <w:r>
-              <w:rPr>
-                <w:rFonts w:ascii="Tahoma" w:hAnsi="Tahoma" w:cs="Tahoma"/>
-                <w:b/>
-                <w:color w:val="000000"/>
-                <w:sz w:val="16"/>
-                <w:szCs w:val="16"/>
-              </w:rPr>
-              <w:t xml:space="preserve">                               </w:t>
+              <w:t xml:space="preserve">                  </w:t>
+            </w:r>
+            <w:r>
+              <w:rPr>
+                <w:rFonts w:ascii="Tahoma" w:hAnsi="Tahoma" w:cs="Tahoma"/>
+                <w:b/>
+                <w:color w:val="000000"/>
+                <w:sz w:val="16"/>
+                <w:szCs w:val="16"/>
+              </w:rPr>
+              <w:t xml:space="preserve">  </w:t>
+            </w:r>
+            <w:r>
+              <w:rPr>
+                <w:rFonts w:ascii="Tahoma" w:hAnsi="Tahoma" w:cs="Tahoma"/>
+                <w:b/>
+                <w:color w:val="000000"/>
+                <w:sz w:val="16"/>
+                <w:szCs w:val="16"/>
+              </w:rPr>
+              <w:t>Issue Type</w:t>
             </w:r>
             <w:r>
               <w:rPr>
@@ -1124,17 +1202,15 @@
             <w:r>
               <w:rPr>
                 <w:rFonts w:ascii="Tahoma" w:hAnsi="Tahoma" w:cs="Tahoma"/>
-                <w:b/>
-                <w:color w:val="000000"/>
-                <w:sz w:val="16"/>
-                <w:szCs w:val="16"/>
-              </w:rPr>
-              <w:t>Issue Type</w:t>
-            </w:r>
-            <w:r>
-              <w:rPr>
-                <w:rFonts w:ascii="Tahoma" w:hAnsi="Tahoma" w:cs="Tahoma"/>
-                <w:b/>
+                <w:color w:val="000000"/>
+                <w:sz w:val="16"/>
+                <w:szCs w:val="16"/>
+              </w:rPr>
+              <w:t>:</w:t>
+            </w:r>
+            <w:r>
+              <w:rPr>
+                <w:rFonts w:ascii="Tahoma" w:hAnsi="Tahoma" w:cs="Tahoma"/>
                 <w:color w:val="000000"/>
                 <w:sz w:val="16"/>
                 <w:szCs w:val="16"/>
@@ -1148,6 +1224,64 @@
                 <w:sz w:val="16"/>
                 <w:szCs w:val="16"/>
               </w:rPr>
+              <w:t>{</w:t>
+            </w:r>
+            <w:r>
+              <w:rPr>
+                <w:rFonts w:ascii="Tahoma" w:hAnsi="Tahoma" w:cs="Tahoma"/>
+                <w:color w:val="262626" w:themeColor="text1" w:themeTint="D9"/>
+                <w:sz w:val="16"/>
+                <w:szCs w:val="16"/>
+                <w:lang w:val="en-IN"/>
+              </w:rPr>
+              <w:t>Types</w:t>
+            </w:r>
+            <w:r>
+              <w:rPr>
+                <w:rFonts w:ascii="Tahoma" w:hAnsi="Tahoma" w:cs="Tahoma"/>
+                <w:color w:val="000000"/>
+                <w:sz w:val="16"/>
+                <w:szCs w:val="16"/>
+              </w:rPr>
+              <w:t>}</w:t>
+            </w:r>
+            <w:r>
+              <w:rPr>
+                <w:rFonts w:ascii="Tahoma" w:hAnsi="Tahoma" w:cs="Tahoma"/>
+                <w:b/>
+                <w:color w:val="000000"/>
+                <w:sz w:val="16"/>
+                <w:szCs w:val="16"/>
+              </w:rPr>
+              <w:t xml:space="preserve">        </w:t>
+            </w:r>
+            <w:r>
+              <w:rPr>
+                <w:rFonts w:ascii="Tahoma" w:hAnsi="Tahoma" w:cs="Tahoma"/>
+                <w:b/>
+                <w:color w:val="000000"/>
+                <w:sz w:val="16"/>
+                <w:szCs w:val="16"/>
+              </w:rPr>
+              <w:t>Issue Location</w:t>
+            </w:r>
+            <w:r>
+              <w:rPr>
+                <w:rFonts w:ascii="Tahoma" w:hAnsi="Tahoma" w:cs="Tahoma"/>
+                <w:b/>
+                <w:color w:val="000000"/>
+                <w:sz w:val="16"/>
+                <w:szCs w:val="16"/>
+              </w:rPr>
+              <w:t xml:space="preserve"> </w:t>
+            </w:r>
+            <w:r>
+              <w:rPr>
+                <w:rFonts w:ascii="Tahoma" w:hAnsi="Tahoma" w:cs="Tahoma"/>
+                <w:color w:val="000000"/>
+                <w:sz w:val="16"/>
+                <w:szCs w:val="16"/>
+              </w:rPr>
               <w:t>:</w:t>
             </w:r>
             <w:r>
@@ -1168,7 +1302,6 @@
               </w:rPr>
               <w:t>{</w:t>
             </w:r>
-            <w:proofErr w:type="spellStart"/>
             <w:r>
               <w:rPr>
                 <w:rFonts w:ascii="Tahoma" w:hAnsi="Tahoma" w:cs="Tahoma"/>
@@ -1177,87 +1310,8 @@
                 <w:szCs w:val="16"/>
                 <w:lang w:val="en-IN"/>
               </w:rPr>
-              <w:t>IssueReturn</w:t>
-            </w:r>
-            <w:proofErr w:type="spellEnd"/>
-            <w:r>
-              <w:rPr>
-                <w:rFonts w:ascii="Tahoma" w:hAnsi="Tahoma" w:cs="Tahoma"/>
-                <w:color w:val="000000"/>
-                <w:sz w:val="16"/>
-                <w:szCs w:val="16"/>
-              </w:rPr>
-              <w:t>}</w:t>
-            </w:r>
-            <w:r>
-              <w:rPr>
-                <w:rFonts w:ascii="Tahoma" w:hAnsi="Tahoma" w:cs="Tahoma"/>
-                <w:b/>
-                <w:color w:val="000000"/>
-                <w:sz w:val="16"/>
-                <w:szCs w:val="16"/>
-              </w:rPr>
-              <w:t xml:space="preserve">                      </w:t>
-            </w:r>
-            <w:r>
-              <w:rPr>
-                <w:rFonts w:ascii="Tahoma" w:hAnsi="Tahoma" w:cs="Tahoma"/>
-                <w:b/>
-                <w:color w:val="000000"/>
-                <w:sz w:val="16"/>
-                <w:szCs w:val="16"/>
-              </w:rPr>
-              <w:t>Issue Location</w:t>
-            </w:r>
-            <w:r>
-              <w:rPr>
-                <w:rFonts w:ascii="Tahoma" w:hAnsi="Tahoma" w:cs="Tahoma"/>
-                <w:b/>
-                <w:color w:val="000000"/>
-                <w:sz w:val="16"/>
-                <w:szCs w:val="16"/>
-              </w:rPr>
-              <w:t xml:space="preserve"> </w:t>
-            </w:r>
-            <w:r>
-              <w:rPr>
-                <w:rFonts w:ascii="Tahoma" w:hAnsi="Tahoma" w:cs="Tahoma"/>
-                <w:color w:val="000000"/>
-                <w:sz w:val="16"/>
-                <w:szCs w:val="16"/>
-              </w:rPr>
-              <w:t>:</w:t>
-            </w:r>
-            <w:r>
-              <w:rPr>
-                <w:rFonts w:ascii="Tahoma" w:hAnsi="Tahoma" w:cs="Tahoma"/>
-                <w:color w:val="000000"/>
-                <w:sz w:val="16"/>
-                <w:szCs w:val="16"/>
-              </w:rPr>
-              <w:t xml:space="preserve"> </w:t>
-            </w:r>
-            <w:r>
-              <w:rPr>
-                <w:rFonts w:ascii="Tahoma" w:hAnsi="Tahoma" w:cs="Tahoma"/>
-                <w:color w:val="000000"/>
-                <w:sz w:val="16"/>
-                <w:szCs w:val="16"/>
-              </w:rPr>
-              <w:t>{</w:t>
-            </w:r>
-            <w:proofErr w:type="spellStart"/>
-            <w:r>
-              <w:rPr>
-                <w:rFonts w:ascii="Tahoma" w:hAnsi="Tahoma" w:cs="Tahoma"/>
-                <w:color w:val="000000"/>
-                <w:sz w:val="16"/>
-                <w:szCs w:val="16"/>
-                <w:lang w:val="en-IN"/>
-              </w:rPr>
-              <w:t>JobWorkLocation</w:t>
-            </w:r>
-            <w:proofErr w:type="spellEnd"/>
+              <w:t>MaterialStorage</w:t>
+            </w:r>
             <w:r>
               <w:rPr>
                 <w:rFonts w:ascii="Tahoma" w:hAnsi="Tahoma" w:cs="Tahoma"/>
@@ -1308,7 +1362,6 @@
               </w:rPr>
               <w:t>{</w:t>
             </w:r>
-            <w:proofErr w:type="spellStart"/>
             <w:r>
               <w:rPr>
                 <w:rFonts w:ascii="Tahoma" w:hAnsi="Tahoma" w:cs="Tahoma"/>
@@ -1319,7 +1372,6 @@
               </w:rPr>
               <w:t>IssueStatus</w:t>
             </w:r>
-            <w:proofErr w:type="spellEnd"/>
             <w:r>
               <w:rPr>
                 <w:rFonts w:ascii="Tahoma" w:hAnsi="Tahoma" w:cs="Tahoma"/>
@@ -1385,29 +1437,7 @@
                 <w:sz w:val="16"/>
                 <w:szCs w:val="16"/>
               </w:rPr>
-              <w:t>{</w:t>
-            </w:r>
-            <w:proofErr w:type="spellStart"/>
-            <w:r>
-              <w:rPr>
-                <w:rFonts w:ascii="Tahoma" w:eastAsia="Arial" w:hAnsi="Tahoma" w:cs="Tahoma"/>
-                <w:b/>
-                <w:bCs/>
-                <w:sz w:val="16"/>
-                <w:szCs w:val="16"/>
-              </w:rPr>
-              <w:t>materialItems</w:t>
-            </w:r>
-            <w:proofErr w:type="spellEnd"/>
-            <w:r>
-              <w:rPr>
-                <w:rFonts w:ascii="Tahoma" w:eastAsia="Arial" w:hAnsi="Tahoma" w:cs="Tahoma"/>
-                <w:b/>
-                <w:bCs/>
-                <w:sz w:val="16"/>
-                <w:szCs w:val="16"/>
-              </w:rPr>
-              <w:t>}</w:t>
+              <w:t>{materialItems}</w:t>
             </w:r>
           </w:p>
           <w:p>
@@ -1428,29 +1458,7 @@
                 <w:sz w:val="16"/>
                 <w:szCs w:val="16"/>
               </w:rPr>
-              <w:t>{</w:t>
-            </w:r>
-            <w:proofErr w:type="spellStart"/>
-            <w:r>
-              <w:rPr>
-                <w:rFonts w:ascii="Tahoma" w:eastAsia="Arial" w:hAnsi="Tahoma" w:cs="Tahoma"/>
-                <w:b/>
-                <w:bCs/>
-                <w:sz w:val="16"/>
-                <w:szCs w:val="16"/>
-              </w:rPr>
-              <w:t>ServiceItems</w:t>
-            </w:r>
-            <w:proofErr w:type="spellEnd"/>
-            <w:r>
-              <w:rPr>
-                <w:rFonts w:ascii="Tahoma" w:eastAsia="Arial" w:hAnsi="Tahoma" w:cs="Tahoma"/>
-                <w:b/>
-                <w:bCs/>
-                <w:sz w:val="16"/>
-                <w:szCs w:val="16"/>
-              </w:rPr>
-              <w:t>}</w:t>
+              <w:t>{ServiceItems}</w:t>
             </w:r>
           </w:p>
           <w:p>
@@ -1502,29 +1510,7 @@
                 <w:sz w:val="16"/>
                 <w:szCs w:val="16"/>
               </w:rPr>
-              <w:t>: {</w:t>
-            </w:r>
-            <w:proofErr w:type="spellStart"/>
-            <w:r>
-              <w:rPr>
-                <w:rFonts w:ascii="Tahoma" w:eastAsia="Arial" w:hAnsi="Tahoma" w:cs="Tahoma"/>
-                <w:b/>
-                <w:bCs/>
-                <w:sz w:val="16"/>
-                <w:szCs w:val="16"/>
-              </w:rPr>
-              <w:t>GrandTotal</w:t>
-            </w:r>
-            <w:proofErr w:type="spellEnd"/>
-            <w:r>
-              <w:rPr>
-                <w:rFonts w:ascii="Tahoma" w:eastAsia="Arial" w:hAnsi="Tahoma" w:cs="Tahoma"/>
-                <w:b/>
-                <w:bCs/>
-                <w:sz w:val="16"/>
-                <w:szCs w:val="16"/>
-              </w:rPr>
-              <w:t>}</w:t>
+              <w:t>: {GrandTotal}</w:t>
             </w:r>
             <w:r>
               <w:rPr>
@@ -1535,29 +1521,7 @@
                 <w:szCs w:val="16"/>
               </w:rPr>
               <w:cr/>
-              <w:t>In Words: {</w:t>
-            </w:r>
-            <w:proofErr w:type="spellStart"/>
-            <w:r>
-              <w:rPr>
-                <w:rFonts w:ascii="Tahoma" w:eastAsia="Arial" w:hAnsi="Tahoma" w:cs="Tahoma"/>
-                <w:b/>
-                <w:bCs/>
-                <w:sz w:val="16"/>
-                <w:szCs w:val="16"/>
-              </w:rPr>
-              <w:t>TotalInWords</w:t>
-            </w:r>
-            <w:proofErr w:type="spellEnd"/>
-            <w:r>
-              <w:rPr>
-                <w:rFonts w:ascii="Tahoma" w:eastAsia="Arial" w:hAnsi="Tahoma" w:cs="Tahoma"/>
-                <w:b/>
-                <w:bCs/>
-                <w:sz w:val="16"/>
-                <w:szCs w:val="16"/>
-              </w:rPr>
-              <w:t>}</w:t>
+              <w:t>In Words: {TotalInWords}</w:t>
             </w:r>
           </w:p>
           <w:p>
@@ -1610,14 +1574,36 @@
             </w:r>
             <w:r>
               <w:rPr>
-                <w:rFonts w:ascii="Tahoma" w:hAnsi="Tahoma" w:cs="Tahoma"/>
+                <w:rFonts w:ascii="Tahoma" w:eastAsia="Arial" w:hAnsi="Tahoma" w:cs="Tahoma"/>
                 <w:b/>
                 <w:bCs/>
                 <w:sz w:val="16"/>
                 <w:szCs w:val="16"/>
                 <w:u w:val="single"/>
               </w:rPr>
-              <w:t>INVENTORY ISSUE</w:t>
+              <w:t>TRANSFORMATION JOB WORK MATERIAL</w:t>
+            </w:r>
+            <w:r>
+              <w:rPr>
+                <w:rFonts w:ascii="Tahoma" w:hAnsi="Tahoma" w:cs="Tahoma"/>
+                <w:b/>
+                <w:bCs/>
+                <w:sz w:val="16"/>
+                <w:szCs w:val="16"/>
+                <w:u w:val="single"/>
+              </w:rPr>
+              <w:t xml:space="preserve"> ISSUE</w:t>
+            </w:r>
+            <w:r>
+              <w:rPr>
+                <w:rFonts w:ascii="Tahoma" w:hAnsi="Tahoma" w:cs="Tahoma"/>
+                <w:b/>
+                <w:bCs/>
+                <w:sz w:val="16"/>
+                <w:szCs w:val="16"/>
+                <w:u w:val="single"/>
+              </w:rPr>
+              <w:t xml:space="preserve"> CHALAAN</w:t>
             </w:r>
             <w:r>
               <w:rPr>
@@ -1788,27 +1774,7 @@
                       <w:sz w:val="16"/>
                       <w:szCs w:val="16"/>
                     </w:rPr>
-                    <w:t xml:space="preserve">For </w:t>
-                  </w:r>
-                  <w:r>
-                    <w:rPr>
-                      <w:rFonts w:ascii="Tahoma" w:eastAsia="Arial" w:hAnsi="Tahoma" w:cs="Tahoma"/>
-                      <w:b/>
-                      <w:bCs/>
-                      <w:sz w:val="16"/>
-                      <w:szCs w:val="16"/>
-                    </w:rPr>
-                    <w:t>ODYSSEY CRAFT(PVT.) LTD</w:t>
-                  </w:r>
-                  <w:r>
-                    <w:rPr>
-                      <w:rFonts w:ascii="Tahoma" w:eastAsia="Arial" w:hAnsi="Tahoma" w:cs="Tahoma"/>
-                      <w:b/>
-                      <w:bCs/>
-                      <w:sz w:val="16"/>
-                      <w:szCs w:val="16"/>
-                    </w:rPr>
-                    <w:t>.</w:t>
+                    <w:t>Vasudha Swaraj Pvt. Ltd.</w:t>
                   </w:r>
                 </w:p>
                 <w:p>
@@ -1921,29 +1887,7 @@
                       <w:sz w:val="16"/>
                       <w:szCs w:val="16"/>
                     </w:rPr>
-                    <w:t>For {</w:t>
-                  </w:r>
-                  <w:proofErr w:type="spellStart"/>
-                  <w:r>
-                    <w:rPr>
-                      <w:rFonts w:ascii="Tahoma" w:eastAsia="Arial" w:hAnsi="Tahoma" w:cs="Tahoma"/>
-                      <w:b/>
-                      <w:bCs/>
-                      <w:sz w:val="16"/>
-                      <w:szCs w:val="16"/>
-                    </w:rPr>
-                    <w:t>VendorName</w:t>
-                  </w:r>
-                  <w:proofErr w:type="spellEnd"/>
-                  <w:r>
-                    <w:rPr>
-                      <w:rFonts w:ascii="Tahoma" w:eastAsia="Arial" w:hAnsi="Tahoma" w:cs="Tahoma"/>
-                      <w:b/>
-                      <w:bCs/>
-                      <w:sz w:val="16"/>
-                      <w:szCs w:val="16"/>
-                    </w:rPr>
-                    <w:t>}</w:t>
+                    <w:t>For {VendorName}</w:t>
                   </w:r>
                 </w:p>
                 <w:p>
@@ -2151,7 +2095,7 @@
                       </mc:Choice>
                       <mc:Fallback>
                         <w:pict>
-                          <v:line w14:anchorId="2CF89FC3" id="Straight Connector 1" o:spid="_x0000_s1026" style="position:absolute;flip:x;z-index:251682816;visibility:visible;mso-wrap-style:square;mso-width-percent:0;mso-height-percent:0;mso-wrap-distance-left:9pt;mso-wrap-distance-top:0;mso-wrap-distance-right:9pt;mso-wrap-distance-bottom:0;mso-position-horizontal:absolute;mso-position-horizontal-relative:text;mso-position-vertical:absolute;mso-position-vertical-relative:text;mso-width-percent:0;mso-height-percent:0;mso-width-relative:margin;mso-height-relative:margin" from="30.2pt,8.35pt" to="139.75pt,8.35pt" o:gfxdata="UEsDBBQABgAIAAAAIQC2gziS/gAAAOEBAAATAAAAW0NvbnRlbnRfVHlwZXNdLnhtbJSRQU7DMBBF&#10;90jcwfIWJU67QAgl6YK0S0CoHGBkTxKLZGx5TGhvj5O2G0SRWNoz/78nu9wcxkFMGNg6quQqL6RA&#10;0s5Y6ir5vt9lD1JwBDIwOMJKHpHlpr69KfdHjyxSmriSfYz+USnWPY7AufNIadK6MEJMx9ApD/oD&#10;OlTrorhX2lFEilmcO2RdNtjC5xDF9pCuTyYBB5bi6bQ4syoJ3g9WQ0ymaiLzg5KdCXlKLjvcW893&#10;SUOqXwnz5DrgnHtJTxOsQfEKIT7DmDSUCaxw7Rqn8787ZsmRM9e2VmPeBN4uqYvTtW7jvijg9N/y&#10;JsXecLq0q+WD6m8AAAD//wMAUEsDBBQABgAIAAAAIQA4/SH/1gAAAJQBAAALAAAAX3JlbHMvLnJl&#10;bHOkkMFqwzAMhu+DvYPRfXGawxijTi+j0GvpHsDYimMaW0Yy2fr2M4PBMnrbUb/Q94l/f/hMi1qR&#10;JVI2sOt6UJgd+ZiDgffL8ekFlFSbvV0oo4EbChzGx4f9GRdb25HMsYhqlCwG5lrLq9biZkxWOiqY&#10;22YiTra2kYMu1l1tQD30/bPm3wwYN0x18gb45AdQl1tp5j/sFB2T0FQ7R0nTNEV3j6o9feQzro1i&#10;OWA14Fm+Q8a1a8+Bvu/d/dMb2JY5uiPbhG/ktn4cqGU/er3pcvwCAAD//wMAUEsDBBQABgAIAAAA&#10;IQCf50qm1QEAAA0EAAAOAAAAZHJzL2Uyb0RvYy54bWysU02P0zAQvSPxHyzfaZIFsRA13UNXCwcE&#10;Fbv8AK8zbiz5S2PTpP+esdOmK0BCrPZieex5b+Y9j9c3kzXsABi1dx1vVjVn4KTvtdt3/MfD3ZsP&#10;nMUkXC+Md9DxI0R+s3n9aj2GFq784E0PyIjExXYMHR9SCm1VRTmAFXHlAzi6VB6tSBTivupRjMRu&#10;TXVV1++r0WMf0EuIkU5v50u+KfxKgUzflIqQmOk49ZbKimV9zGu1WYt2jyIMWp7aEM/owgrtqOhC&#10;dSuSYD9R/0FltUQfvUor6W3lldISigZS09S/qbkfRICihcyJYbEpvhyt/HrYIdM9vR1nTlh6ovuE&#10;Qu+HxLbeOTLQI2uyT2OILaVv3Q5PUQw7zKInhZYpo8PnTJNPSBibisvHxWWYEpN02Lz92Ly7vuZM&#10;nu+qmSIDA8b0CbxledNxo102QLTi8CUmKkup55R8bFxeoze6v9PGlCCPDmwNsoOgR09TaZ5wT7Io&#10;ysgqS5pFlF06GphZv4MiU3KzpXoZxwunkBJcOvMaR9kZpqiDBVj/G3jKz1Aoo/o/4AVRKnuXFrDV&#10;zuPfql+sUHP+2YFZd7bg0ffH8rzFGpq54vjpf+ShfhoX+OUXb34BAAD//wMAUEsDBBQABgAIAAAA&#10;IQCd+jxJ3gAAAAgBAAAPAAAAZHJzL2Rvd25yZXYueG1sTI/BTsMwEETvSPyDtUjcqNMKUghxKoTE&#10;AakqpeUAN9dekkC8DrbThr/vIg5w3JnR7JtyMbpO7DHE1pOC6SQDgWS8balW8LJ9uLgGEZMmqztP&#10;qOAbIyyq05NSF9Yf6Bn3m1QLLqFYaAVNSn0hZTQNOh0nvkdi790HpxOfoZY26AOXu07OsiyXTrfE&#10;Hxrd432D5nMzOAWv08evtek/1tsns3wLy7RaYRqUOj8b725BJBzTXxh+8BkdKmba+YFsFJ2CPLvk&#10;JOv5HAT7s/nNFYjdryCrUv4fUB0BAAD//wMAUEsBAi0AFAAGAAgAAAAhALaDOJL+AAAA4QEAABMA&#10;AAAAAAAAAAAAAAAAAAAAAFtDb250ZW50X1R5cGVzXS54bWxQSwECLQAUAAYACAAAACEAOP0h/9YA&#10;AACUAQAACwAAAAAAAAAAAAAAAAAvAQAAX3JlbHMvLnJlbHNQSwECLQAUAAYACAAAACEAn+dKptUB&#10;AAANBAAADgAAAAAAAAAAAAAAAAAuAgAAZHJzL2Uyb0RvYy54bWxQSwECLQAUAAYACAAAACEAnfo8&#10;Sd4AAAAIAQAADwAAAAAAAAAAAAAAAAAvBAAAZHJzL2Rvd25yZXYueG1sUEsFBgAAAAAEAAQA8wAA&#10;ADoFAAAAAA==&#10;" strokecolor="black [3213]" strokeweight=".5pt">
+                          <v:line w14:anchorId="4372BD82" id="Straight Connector 1" o:spid="_x0000_s1026" style="position:absolute;flip:x;z-index:251682816;visibility:visible;mso-wrap-style:square;mso-width-percent:0;mso-height-percent:0;mso-wrap-distance-left:9pt;mso-wrap-distance-top:0;mso-wrap-distance-right:9pt;mso-wrap-distance-bottom:0;mso-position-horizontal:absolute;mso-position-horizontal-relative:text;mso-position-vertical:absolute;mso-position-vertical-relative:text;mso-width-percent:0;mso-height-percent:0;mso-width-relative:margin;mso-height-relative:margin" from="30.2pt,8.35pt" to="139.75pt,8.35pt" o:gfxdata="UEsDBBQABgAIAAAAIQC2gziS/gAAAOEBAAATAAAAW0NvbnRlbnRfVHlwZXNdLnhtbJSRQU7DMBBF&#10;90jcwfIWJU67QAgl6YK0S0CoHGBkTxKLZGx5TGhvj5O2G0SRWNoz/78nu9wcxkFMGNg6quQqL6RA&#10;0s5Y6ir5vt9lD1JwBDIwOMJKHpHlpr69KfdHjyxSmriSfYz+USnWPY7AufNIadK6MEJMx9ApD/oD&#10;OlTrorhX2lFEilmcO2RdNtjC5xDF9pCuTyYBB5bi6bQ4syoJ3g9WQ0ymaiLzg5KdCXlKLjvcW893&#10;SUOqXwnz5DrgnHtJTxOsQfEKIT7DmDSUCaxw7Rqn8787ZsmRM9e2VmPeBN4uqYvTtW7jvijg9N/y&#10;JsXecLq0q+WD6m8AAAD//wMAUEsDBBQABgAIAAAAIQA4/SH/1gAAAJQBAAALAAAAX3JlbHMvLnJl&#10;bHOkkMFqwzAMhu+DvYPRfXGawxijTi+j0GvpHsDYimMaW0Yy2fr2M4PBMnrbUb/Q94l/f/hMi1qR&#10;JVI2sOt6UJgd+ZiDgffL8ekFlFSbvV0oo4EbChzGx4f9GRdb25HMsYhqlCwG5lrLq9biZkxWOiqY&#10;22YiTra2kYMu1l1tQD30/bPm3wwYN0x18gb45AdQl1tp5j/sFB2T0FQ7R0nTNEV3j6o9feQzro1i&#10;OWA14Fm+Q8a1a8+Bvu/d/dMb2JY5uiPbhG/ktn4cqGU/er3pcvwCAAD//wMAUEsDBBQABgAIAAAA&#10;IQCf50qm1QEAAA0EAAAOAAAAZHJzL2Uyb0RvYy54bWysU02P0zAQvSPxHyzfaZIFsRA13UNXCwcE&#10;Fbv8AK8zbiz5S2PTpP+esdOmK0BCrPZieex5b+Y9j9c3kzXsABi1dx1vVjVn4KTvtdt3/MfD3ZsP&#10;nMUkXC+Md9DxI0R+s3n9aj2GFq784E0PyIjExXYMHR9SCm1VRTmAFXHlAzi6VB6tSBTivupRjMRu&#10;TXVV1++r0WMf0EuIkU5v50u+KfxKgUzflIqQmOk49ZbKimV9zGu1WYt2jyIMWp7aEM/owgrtqOhC&#10;dSuSYD9R/0FltUQfvUor6W3lldISigZS09S/qbkfRICihcyJYbEpvhyt/HrYIdM9vR1nTlh6ovuE&#10;Qu+HxLbeOTLQI2uyT2OILaVv3Q5PUQw7zKInhZYpo8PnTJNPSBibisvHxWWYEpN02Lz92Ly7vuZM&#10;nu+qmSIDA8b0CbxledNxo102QLTi8CUmKkup55R8bFxeoze6v9PGlCCPDmwNsoOgR09TaZ5wT7Io&#10;ysgqS5pFlF06GphZv4MiU3KzpXoZxwunkBJcOvMaR9kZpqiDBVj/G3jKz1Aoo/o/4AVRKnuXFrDV&#10;zuPfql+sUHP+2YFZd7bg0ffH8rzFGpq54vjpf+ShfhoX+OUXb34BAAD//wMAUEsDBBQABgAIAAAA&#10;IQCd+jxJ3gAAAAgBAAAPAAAAZHJzL2Rvd25yZXYueG1sTI/BTsMwEETvSPyDtUjcqNMKUghxKoTE&#10;AakqpeUAN9dekkC8DrbThr/vIg5w3JnR7JtyMbpO7DHE1pOC6SQDgWS8balW8LJ9uLgGEZMmqztP&#10;qOAbIyyq05NSF9Yf6Bn3m1QLLqFYaAVNSn0hZTQNOh0nvkdi790HpxOfoZY26AOXu07OsiyXTrfE&#10;Hxrd432D5nMzOAWv08evtek/1tsns3wLy7RaYRqUOj8b725BJBzTXxh+8BkdKmba+YFsFJ2CPLvk&#10;JOv5HAT7s/nNFYjdryCrUv4fUB0BAAD//wMAUEsBAi0AFAAGAAgAAAAhALaDOJL+AAAA4QEAABMA&#10;AAAAAAAAAAAAAAAAAAAAAFtDb250ZW50X1R5cGVzXS54bWxQSwECLQAUAAYACAAAACEAOP0h/9YA&#10;AACUAQAACwAAAAAAAAAAAAAAAAAvAQAAX3JlbHMvLnJlbHNQSwECLQAUAAYACAAAACEAn+dKptUB&#10;AAANBAAADgAAAAAAAAAAAAAAAAAuAgAAZHJzL2Uyb0RvYy54bWxQSwECLQAUAAYACAAAACEAnfo8&#10;Sd4AAAAIAQAADwAAAAAAAAAAAAAAAAAvBAAAZHJzL2Rvd25yZXYueG1sUEsFBgAAAAAEAAQA8wAA&#10;ADoFAAAAAA==&#10;" strokecolor="black [3213]" strokeweight=".5pt">
                             <v:stroke joinstyle="miter"/>
                           </v:line>
                         </w:pict>
@@ -2167,7 +2111,6 @@
                     </w:rPr>
                     <w:t>{</w:t>
                   </w:r>
-                  <w:proofErr w:type="spellStart"/>
                   <w:r>
                     <w:rPr>
                       <w:rFonts w:ascii="Tahoma" w:hAnsi="Tahoma" w:cs="Tahoma"/>
@@ -2178,7 +2121,6 @@
                     </w:rPr>
                     <w:t>AddedBy</w:t>
                   </w:r>
-                  <w:proofErr w:type="spellEnd"/>
                   <w:r>
                     <w:rPr>
                       <w:rFonts w:ascii="Tahoma" w:eastAsia="Arial" w:hAnsi="Tahoma" w:cs="Tahoma"/>
@@ -2272,7 +2214,7 @@
                       </mc:Choice>
                       <mc:Fallback>
                         <w:pict>
-                          <v:line w14:anchorId="3B8D21BF" id="Straight Connector 2" o:spid="_x0000_s1026" style="position:absolute;z-index:251685888;visibility:visible;mso-wrap-style:square;mso-wrap-distance-left:9pt;mso-wrap-distance-top:0;mso-wrap-distance-right:9pt;mso-wrap-distance-bottom:0;mso-position-horizontal:absolute;mso-position-horizontal-relative:text;mso-position-vertical:absolute;mso-position-vertical-relative:text" from="31.2pt,8.35pt" to="143.25pt,8.35pt" o:gfxdata="UEsDBBQABgAIAAAAIQC2gziS/gAAAOEBAAATAAAAW0NvbnRlbnRfVHlwZXNdLnhtbJSRQU7DMBBF&#10;90jcwfIWJU67QAgl6YK0S0CoHGBkTxKLZGx5TGhvj5O2G0SRWNoz/78nu9wcxkFMGNg6quQqL6RA&#10;0s5Y6ir5vt9lD1JwBDIwOMJKHpHlpr69KfdHjyxSmriSfYz+USnWPY7AufNIadK6MEJMx9ApD/oD&#10;OlTrorhX2lFEilmcO2RdNtjC5xDF9pCuTyYBB5bi6bQ4syoJ3g9WQ0ymaiLzg5KdCXlKLjvcW893&#10;SUOqXwnz5DrgnHtJTxOsQfEKIT7DmDSUCaxw7Rqn8787ZsmRM9e2VmPeBN4uqYvTtW7jvijg9N/y&#10;JsXecLq0q+WD6m8AAAD//wMAUEsDBBQABgAIAAAAIQA4/SH/1gAAAJQBAAALAAAAX3JlbHMvLnJl&#10;bHOkkMFqwzAMhu+DvYPRfXGawxijTi+j0GvpHsDYimMaW0Yy2fr2M4PBMnrbUb/Q94l/f/hMi1qR&#10;JVI2sOt6UJgd+ZiDgffL8ekFlFSbvV0oo4EbChzGx4f9GRdb25HMsYhqlCwG5lrLq9biZkxWOiqY&#10;22YiTra2kYMu1l1tQD30/bPm3wwYN0x18gb45AdQl1tp5j/sFB2T0FQ7R0nTNEV3j6o9feQzro1i&#10;OWA14Fm+Q8a1a8+Bvu/d/dMb2JY5uiPbhG/ktn4cqGU/er3pcvwCAAD//wMAUEsDBBQABgAIAAAA&#10;IQC5xdxRzgEAAAMEAAAOAAAAZHJzL2Uyb0RvYy54bWysU8tu2zAQvBfoPxC815KVoggEyzk4SC5F&#10;azTtBzDU0iLAF5asJf99l5QtB02BokUulJbcmd0ZLjd3kzXsCBi1dx1fr2rOwEnfa3fo+I/vDx9u&#10;OYtJuF4Y76DjJ4j8bvv+3WYMLTR+8KYHZETiYjuGjg8phbaqohzAirjyARwdKo9WJArxUPUoRmK3&#10;pmrq+lM1euwDegkx0u79fMi3hV8pkOmrUhESMx2n3lJZsazPea22G9EeUIRBy3Mb4j+6sEI7KrpQ&#10;3Ysk2E/Ur6isluijV2klva28UlpC0UBq1vVvap4GEaBoIXNiWGyKb0crvxz3yHTf8YYzJyxd0VNC&#10;oQ9DYjvvHBnokTXZpzHEltJ3bo/nKIY9ZtGTQpu/JIdNxdvT4i1MiUnaXH9sbprbG87k5ay6AgPG&#10;9AjesvzTcaNdli1acfwcExWj1EtK3jYur9Eb3T9oY0qQBwZ2BtlR0FWnaZ1bJtyLLIoysspC5tbL&#10;XzoZmFm/gSIrcrOlehnCK6eQEly68BpH2RmmqIMFWP8deM7PUCgD+i/gBVEqe5cWsNXO45+qX61Q&#10;c/7FgVl3tuDZ96dyqcUamrTi3PlV5FF+GRf49e1ufwEAAP//AwBQSwMEFAAGAAgAAAAhAN5/9rTe&#10;AAAACAEAAA8AAABkcnMvZG93bnJldi54bWxMj0FLw0AQhe+C/2EZwYvYjdGuJWZTJNCLB8FGisdt&#10;Ms0Gs7Mhu23Sf++Ih3qc9x5vvpevZ9eLE46h86ThYZGAQKp901Gr4bPa3K9AhGioMb0n1HDGAOvi&#10;+io3WeMn+sDTNraCSyhkRoONccikDLVFZ8LCD0jsHfzoTORzbGUzmonLXS/TJFHSmY74gzUDlhbr&#10;7+3Rafhq7x43u4qqqYzvB2Xn8+5tWWp9ezO/voCIOMdLGH7xGR0KZtr7IzVB9BpU+sRJ1tUzCPbT&#10;lVqC2P8Jssjl/wHFDwAAAP//AwBQSwECLQAUAAYACAAAACEAtoM4kv4AAADhAQAAEwAAAAAAAAAA&#10;AAAAAAAAAAAAW0NvbnRlbnRfVHlwZXNdLnhtbFBLAQItABQABgAIAAAAIQA4/SH/1gAAAJQBAAAL&#10;AAAAAAAAAAAAAAAAAC8BAABfcmVscy8ucmVsc1BLAQItABQABgAIAAAAIQC5xdxRzgEAAAMEAAAO&#10;AAAAAAAAAAAAAAAAAC4CAABkcnMvZTJvRG9jLnhtbFBLAQItABQABgAIAAAAIQDef/a03gAAAAgB&#10;AAAPAAAAAAAAAAAAAAAAACgEAABkcnMvZG93bnJldi54bWxQSwUGAAAAAAQABADzAAAAMwUAAAAA&#10;" strokecolor="black [3213]" strokeweight=".5pt">
+                          <v:line w14:anchorId="64BFBF14" id="Straight Connector 2" o:spid="_x0000_s1026" style="position:absolute;z-index:251685888;visibility:visible;mso-wrap-style:square;mso-wrap-distance-left:9pt;mso-wrap-distance-top:0;mso-wrap-distance-right:9pt;mso-wrap-distance-bottom:0;mso-position-horizontal:absolute;mso-position-horizontal-relative:text;mso-position-vertical:absolute;mso-position-vertical-relative:text" from="31.2pt,8.35pt" to="143.25pt,8.35pt" o:gfxdata="UEsDBBQABgAIAAAAIQC2gziS/gAAAOEBAAATAAAAW0NvbnRlbnRfVHlwZXNdLnhtbJSRQU7DMBBF&#10;90jcwfIWJU67QAgl6YK0S0CoHGBkTxKLZGx5TGhvj5O2G0SRWNoz/78nu9wcxkFMGNg6quQqL6RA&#10;0s5Y6ir5vt9lD1JwBDIwOMJKHpHlpr69KfdHjyxSmriSfYz+USnWPY7AufNIadK6MEJMx9ApD/oD&#10;OlTrorhX2lFEilmcO2RdNtjC5xDF9pCuTyYBB5bi6bQ4syoJ3g9WQ0ymaiLzg5KdCXlKLjvcW893&#10;SUOqXwnz5DrgnHtJTxOsQfEKIT7DmDSUCaxw7Rqn8787ZsmRM9e2VmPeBN4uqYvTtW7jvijg9N/y&#10;JsXecLq0q+WD6m8AAAD//wMAUEsDBBQABgAIAAAAIQA4/SH/1gAAAJQBAAALAAAAX3JlbHMvLnJl&#10;bHOkkMFqwzAMhu+DvYPRfXGawxijTi+j0GvpHsDYimMaW0Yy2fr2M4PBMnrbUb/Q94l/f/hMi1qR&#10;JVI2sOt6UJgd+ZiDgffL8ekFlFSbvV0oo4EbChzGx4f9GRdb25HMsYhqlCwG5lrLq9biZkxWOiqY&#10;22YiTra2kYMu1l1tQD30/bPm3wwYN0x18gb45AdQl1tp5j/sFB2T0FQ7R0nTNEV3j6o9feQzro1i&#10;OWA14Fm+Q8a1a8+Bvu/d/dMb2JY5uiPbhG/ktn4cqGU/er3pcvwCAAD//wMAUEsDBBQABgAIAAAA&#10;IQC5xdxRzgEAAAMEAAAOAAAAZHJzL2Uyb0RvYy54bWysU8tu2zAQvBfoPxC815KVoggEyzk4SC5F&#10;azTtBzDU0iLAF5asJf99l5QtB02BokUulJbcmd0ZLjd3kzXsCBi1dx1fr2rOwEnfa3fo+I/vDx9u&#10;OYtJuF4Y76DjJ4j8bvv+3WYMLTR+8KYHZETiYjuGjg8phbaqohzAirjyARwdKo9WJArxUPUoRmK3&#10;pmrq+lM1euwDegkx0u79fMi3hV8pkOmrUhESMx2n3lJZsazPea22G9EeUIRBy3Mb4j+6sEI7KrpQ&#10;3Ysk2E/Ur6isluijV2klva28UlpC0UBq1vVvap4GEaBoIXNiWGyKb0crvxz3yHTf8YYzJyxd0VNC&#10;oQ9DYjvvHBnokTXZpzHEltJ3bo/nKIY9ZtGTQpu/JIdNxdvT4i1MiUnaXH9sbprbG87k5ay6AgPG&#10;9AjesvzTcaNdli1acfwcExWj1EtK3jYur9Eb3T9oY0qQBwZ2BtlR0FWnaZ1bJtyLLIoysspC5tbL&#10;XzoZmFm/gSIrcrOlehnCK6eQEly68BpH2RmmqIMFWP8deM7PUCgD+i/gBVEqe5cWsNXO45+qX61Q&#10;c/7FgVl3tuDZ96dyqcUamrTi3PlV5FF+GRf49e1ufwEAAP//AwBQSwMEFAAGAAgAAAAhAN5/9rTe&#10;AAAACAEAAA8AAABkcnMvZG93bnJldi54bWxMj0FLw0AQhe+C/2EZwYvYjdGuJWZTJNCLB8FGisdt&#10;Ms0Gs7Mhu23Sf++Ih3qc9x5vvpevZ9eLE46h86ThYZGAQKp901Gr4bPa3K9AhGioMb0n1HDGAOvi&#10;+io3WeMn+sDTNraCSyhkRoONccikDLVFZ8LCD0jsHfzoTORzbGUzmonLXS/TJFHSmY74gzUDlhbr&#10;7+3Rafhq7x43u4qqqYzvB2Xn8+5tWWp9ezO/voCIOMdLGH7xGR0KZtr7IzVB9BpU+sRJ1tUzCPbT&#10;lVqC2P8Jssjl/wHFDwAAAP//AwBQSwECLQAUAAYACAAAACEAtoM4kv4AAADhAQAAEwAAAAAAAAAA&#10;AAAAAAAAAAAAW0NvbnRlbnRfVHlwZXNdLnhtbFBLAQItABQABgAIAAAAIQA4/SH/1gAAAJQBAAAL&#10;AAAAAAAAAAAAAAAAAC8BAABfcmVscy8ucmVsc1BLAQItABQABgAIAAAAIQC5xdxRzgEAAAMEAAAO&#10;AAAAAAAAAAAAAAAAAC4CAABkcnMvZTJvRG9jLnhtbFBLAQItABQABgAIAAAAIQDef/a03gAAAAgB&#10;AAAPAAAAAAAAAAAAAAAAACgEAABkcnMvZG93bnJldi54bWxQSwUGAAAAAAQABADzAAAAMwUAAAAA&#10;" strokecolor="black [3213]" strokeweight=".5pt">
                             <v:stroke joinstyle="miter"/>
                           </v:line>
                         </w:pict>
@@ -2297,7 +2239,6 @@
                     </w:rPr>
                     <w:t>{</w:t>
                   </w:r>
-                  <w:proofErr w:type="spellStart"/>
                   <w:r>
                     <w:rPr>
                       <w:rFonts w:ascii="Consolas" w:hAnsi="Consolas" w:cs="Consolas"/>
@@ -2308,7 +2249,6 @@
                     </w:rPr>
                     <w:t>EmployeeName</w:t>
                   </w:r>
-                  <w:proofErr w:type="spellEnd"/>
                   <w:r>
                     <w:rPr>
                       <w:rFonts w:ascii="Tahoma" w:eastAsia="Arial" w:hAnsi="Tahoma" w:cs="Tahoma"/>
@@ -2403,7 +2343,7 @@
                       </mc:Choice>
                       <mc:Fallback>
                         <w:pict>
-                          <v:line w14:anchorId="32A4C459" id="Straight Connector 3" o:spid="_x0000_s1026" style="position:absolute;z-index:251683840;visibility:visible;mso-wrap-style:square;mso-width-percent:0;mso-wrap-distance-left:9pt;mso-wrap-distance-top:0;mso-wrap-distance-right:9pt;mso-wrap-distance-bottom:0;mso-position-horizontal:absolute;mso-position-horizontal-relative:text;mso-position-vertical:absolute;mso-position-vertical-relative:text;mso-width-percent:0;mso-width-relative:margin" from="23.5pt,8.35pt" to="143.7pt,8.35pt" o:gfxdata="UEsDBBQABgAIAAAAIQC2gziS/gAAAOEBAAATAAAAW0NvbnRlbnRfVHlwZXNdLnhtbJSRQU7DMBBF&#10;90jcwfIWJU67QAgl6YK0S0CoHGBkTxKLZGx5TGhvj5O2G0SRWNoz/78nu9wcxkFMGNg6quQqL6RA&#10;0s5Y6ir5vt9lD1JwBDIwOMJKHpHlpr69KfdHjyxSmriSfYz+USnWPY7AufNIadK6MEJMx9ApD/oD&#10;OlTrorhX2lFEilmcO2RdNtjC5xDF9pCuTyYBB5bi6bQ4syoJ3g9WQ0ymaiLzg5KdCXlKLjvcW893&#10;SUOqXwnz5DrgnHtJTxOsQfEKIT7DmDSUCaxw7Rqn8787ZsmRM9e2VmPeBN4uqYvTtW7jvijg9N/y&#10;JsXecLq0q+WD6m8AAAD//wMAUEsDBBQABgAIAAAAIQA4/SH/1gAAAJQBAAALAAAAX3JlbHMvLnJl&#10;bHOkkMFqwzAMhu+DvYPRfXGawxijTi+j0GvpHsDYimMaW0Yy2fr2M4PBMnrbUb/Q94l/f/hMi1qR&#10;JVI2sOt6UJgd+ZiDgffL8ekFlFSbvV0oo4EbChzGx4f9GRdb25HMsYhqlCwG5lrLq9biZkxWOiqY&#10;22YiTra2kYMu1l1tQD30/bPm3wwYN0x18gb45AdQl1tp5j/sFB2T0FQ7R0nTNEV3j6o9feQzro1i&#10;OWA14Fm+Q8a1a8+Bvu/d/dMb2JY5uiPbhG/ktn4cqGU/er3pcvwCAAD//wMAUEsDBBQABgAIAAAA&#10;IQCKN/MezgEAAAMEAAAOAAAAZHJzL2Uyb0RvYy54bWysU02P0zAQvSPxHyzfadKutkJR0z10tVwQ&#10;VCz8AK8zbizZHmts+vHvGbttugIkBOLiZOx5b+Y9j1cPR+/EHihZDL2cz1opIGgcbNj18tvXp3fv&#10;pUhZhUE5DNDLEyT5sH77ZnWIHSxwRDcACSYJqTvEXo45x65pkh7BqzTDCIEPDZJXmUPaNQOpA7N7&#10;1yzadtkckIZIqCEl3n08H8p15TcGdP5sTIIsXC+5t1xXqutLWZv1SnU7UnG0+tKG+ocuvLKBi05U&#10;jyor8Z3sL1TeasKEJs80+gaNsRqqBlYzb39S8zyqCFULm5PiZFP6f7T6035Lwg69vJMiKM9X9JxJ&#10;2d2YxQZDYAORxF3x6RBTx+mbsKVLlOKWiuijIV++LEccq7enyVs4ZqF5c36/WC7v+Qr09ay5ASOl&#10;/AHQi/LTS2dDka06tf+YMhfj1GtK2XahrAmdHZ6sczUoAwMbR2Kv+KrzcV5aZtyrLI4KsilCzq3X&#10;v3xycGb9AoatKM3W6nUIb5xKawj5yusCZxeY4Q4mYPtn4CW/QKEO6N+AJ0StjCFPYG8D0u+q36ww&#10;5/yrA2fdxYIXHE71Uqs1PGnVucurKKP8Oq7w29td/wAAAP//AwBQSwMEFAAGAAgAAAAhAJPMocze&#10;AAAACAEAAA8AAABkcnMvZG93bnJldi54bWxMj0FLw0AQhe+C/2EZwYvYjbUmJWZTJNCLB8FGisdt&#10;dpoNZmdDdtuk/94RD3qc9x5vvldsZteLM46h86TgYZGAQGq86ahV8FFv79cgQtRkdO8JFVwwwKa8&#10;vip0bvxE73jexVZwCYVcK7AxDrmUobHodFj4AYm9ox+djnyOrTSjnrjc9XKZJKl0uiP+YPWAlcXm&#10;a3dyCj7bu8ftvqZ6quLbMbXzZf/6VCl1ezO/PIOIOMe/MPzgMzqUzHTwJzJB9ApWGU+JrKcZCPaX&#10;62wF4vAryLKQ/weU3wAAAP//AwBQSwECLQAUAAYACAAAACEAtoM4kv4AAADhAQAAEwAAAAAAAAAA&#10;AAAAAAAAAAAAW0NvbnRlbnRfVHlwZXNdLnhtbFBLAQItABQABgAIAAAAIQA4/SH/1gAAAJQBAAAL&#10;AAAAAAAAAAAAAAAAAC8BAABfcmVscy8ucmVsc1BLAQItABQABgAIAAAAIQCKN/MezgEAAAMEAAAO&#10;AAAAAAAAAAAAAAAAAC4CAABkcnMvZTJvRG9jLnhtbFBLAQItABQABgAIAAAAIQCTzKHM3gAAAAgB&#10;AAAPAAAAAAAAAAAAAAAAACgEAABkcnMvZG93bnJldi54bWxQSwUGAAAAAAQABADzAAAAMwUAAAAA&#10;" strokecolor="black [3213]" strokeweight=".5pt">
+                          <v:line w14:anchorId="7454C466" id="Straight Connector 3" o:spid="_x0000_s1026" style="position:absolute;z-index:251683840;visibility:visible;mso-wrap-style:square;mso-width-percent:0;mso-wrap-distance-left:9pt;mso-wrap-distance-top:0;mso-wrap-distance-right:9pt;mso-wrap-distance-bottom:0;mso-position-horizontal:absolute;mso-position-horizontal-relative:text;mso-position-vertical:absolute;mso-position-vertical-relative:text;mso-width-percent:0;mso-width-relative:margin" from="23.5pt,8.35pt" to="143.7pt,8.35pt" o:gfxdata="UEsDBBQABgAIAAAAIQC2gziS/gAAAOEBAAATAAAAW0NvbnRlbnRfVHlwZXNdLnhtbJSRQU7DMBBF&#10;90jcwfIWJU67QAgl6YK0S0CoHGBkTxKLZGx5TGhvj5O2G0SRWNoz/78nu9wcxkFMGNg6quQqL6RA&#10;0s5Y6ir5vt9lD1JwBDIwOMJKHpHlpr69KfdHjyxSmriSfYz+USnWPY7AufNIadK6MEJMx9ApD/oD&#10;OlTrorhX2lFEilmcO2RdNtjC5xDF9pCuTyYBB5bi6bQ4syoJ3g9WQ0ymaiLzg5KdCXlKLjvcW893&#10;SUOqXwnz5DrgnHtJTxOsQfEKIT7DmDSUCaxw7Rqn8787ZsmRM9e2VmPeBN4uqYvTtW7jvijg9N/y&#10;JsXecLq0q+WD6m8AAAD//wMAUEsDBBQABgAIAAAAIQA4/SH/1gAAAJQBAAALAAAAX3JlbHMvLnJl&#10;bHOkkMFqwzAMhu+DvYPRfXGawxijTi+j0GvpHsDYimMaW0Yy2fr2M4PBMnrbUb/Q94l/f/hMi1qR&#10;JVI2sOt6UJgd+ZiDgffL8ekFlFSbvV0oo4EbChzGx4f9GRdb25HMsYhqlCwG5lrLq9biZkxWOiqY&#10;22YiTra2kYMu1l1tQD30/bPm3wwYN0x18gb45AdQl1tp5j/sFB2T0FQ7R0nTNEV3j6o9feQzro1i&#10;OWA14Fm+Q8a1a8+Bvu/d/dMb2JY5uiPbhG/ktn4cqGU/er3pcvwCAAD//wMAUEsDBBQABgAIAAAA&#10;IQCKN/MezgEAAAMEAAAOAAAAZHJzL2Uyb0RvYy54bWysU02P0zAQvSPxHyzfadKutkJR0z10tVwQ&#10;VCz8AK8zbizZHmts+vHvGbttugIkBOLiZOx5b+Y9j1cPR+/EHihZDL2cz1opIGgcbNj18tvXp3fv&#10;pUhZhUE5DNDLEyT5sH77ZnWIHSxwRDcACSYJqTvEXo45x65pkh7BqzTDCIEPDZJXmUPaNQOpA7N7&#10;1yzadtkckIZIqCEl3n08H8p15TcGdP5sTIIsXC+5t1xXqutLWZv1SnU7UnG0+tKG+ocuvLKBi05U&#10;jyor8Z3sL1TeasKEJs80+gaNsRqqBlYzb39S8zyqCFULm5PiZFP6f7T6035Lwg69vJMiKM9X9JxJ&#10;2d2YxQZDYAORxF3x6RBTx+mbsKVLlOKWiuijIV++LEccq7enyVs4ZqF5c36/WC7v+Qr09ay5ASOl&#10;/AHQi/LTS2dDka06tf+YMhfj1GtK2XahrAmdHZ6sczUoAwMbR2Kv+KrzcV5aZtyrLI4KsilCzq3X&#10;v3xycGb9AoatKM3W6nUIb5xKawj5yusCZxeY4Q4mYPtn4CW/QKEO6N+AJ0StjCFPYG8D0u+q36ww&#10;5/yrA2fdxYIXHE71Uqs1PGnVucurKKP8Oq7w29td/wAAAP//AwBQSwMEFAAGAAgAAAAhAJPMocze&#10;AAAACAEAAA8AAABkcnMvZG93bnJldi54bWxMj0FLw0AQhe+C/2EZwYvYjbUmJWZTJNCLB8FGisdt&#10;dpoNZmdDdtuk/94RD3qc9x5vvldsZteLM46h86TgYZGAQGq86ahV8FFv79cgQtRkdO8JFVwwwKa8&#10;vip0bvxE73jexVZwCYVcK7AxDrmUobHodFj4AYm9ox+djnyOrTSjnrjc9XKZJKl0uiP+YPWAlcXm&#10;a3dyCj7bu8ftvqZ6quLbMbXzZf/6VCl1ezO/PIOIOMe/MPzgMzqUzHTwJzJB9ApWGU+JrKcZCPaX&#10;62wF4vAryLKQ/weU3wAAAP//AwBQSwECLQAUAAYACAAAACEAtoM4kv4AAADhAQAAEwAAAAAAAAAA&#10;AAAAAAAAAAAAW0NvbnRlbnRfVHlwZXNdLnhtbFBLAQItABQABgAIAAAAIQA4/SH/1gAAAJQBAAAL&#10;AAAAAAAAAAAAAAAAAC8BAABfcmVscy8ucmVsc1BLAQItABQABgAIAAAAIQCKN/MezgEAAAMEAAAO&#10;AAAAAAAAAAAAAAAAAC4CAABkcnMvZTJvRG9jLnhtbFBLAQItABQABgAIAAAAIQCTzKHM3gAAAAgB&#10;AAAPAAAAAAAAAAAAAAAAACgEAABkcnMvZG93bnJldi54bWxQSwUGAAAAAAQABADzAAAAMwUAAAAA&#10;" strokecolor="black [3213]" strokeweight=".5pt">
                             <v:stroke joinstyle="miter"/>
                           </v:line>
                         </w:pict>
@@ -2419,7 +2359,6 @@
                     </w:rPr>
                     <w:t xml:space="preserve">       {</w:t>
                   </w:r>
-                  <w:proofErr w:type="spellStart"/>
                   <w:r>
                     <w:rPr>
                       <w:rFonts w:ascii="Tahoma" w:hAnsi="Tahoma" w:cs="Tahoma"/>
@@ -2430,7 +2369,6 @@
                     </w:rPr>
                     <w:t>CheckedByName</w:t>
                   </w:r>
-                  <w:proofErr w:type="spellEnd"/>
                   <w:r>
                     <w:rPr>
                       <w:rFonts w:ascii="Tahoma" w:eastAsia="Arial" w:hAnsi="Tahoma" w:cs="Tahoma"/>
@@ -2522,7 +2460,7 @@
                       </mc:Choice>
                       <mc:Fallback>
                         <w:pict>
-                          <v:line w14:anchorId="3D97D9C3" id="Straight Connector 5" o:spid="_x0000_s1026" style="position:absolute;z-index:251684864;visibility:visible;mso-wrap-style:square;mso-wrap-distance-left:9pt;mso-wrap-distance-top:0;mso-wrap-distance-right:9pt;mso-wrap-distance-bottom:0;mso-position-horizontal:absolute;mso-position-horizontal-relative:text;mso-position-vertical:absolute;mso-position-vertical-relative:text" from="31.2pt,8.35pt" to="143.25pt,8.35pt" o:gfxdata="UEsDBBQABgAIAAAAIQC2gziS/gAAAOEBAAATAAAAW0NvbnRlbnRfVHlwZXNdLnhtbJSRQU7DMBBF&#10;90jcwfIWJU67QAgl6YK0S0CoHGBkTxKLZGx5TGhvj5O2G0SRWNoz/78nu9wcxkFMGNg6quQqL6RA&#10;0s5Y6ir5vt9lD1JwBDIwOMJKHpHlpr69KfdHjyxSmriSfYz+USnWPY7AufNIadK6MEJMx9ApD/oD&#10;OlTrorhX2lFEilmcO2RdNtjC5xDF9pCuTyYBB5bi6bQ4syoJ3g9WQ0ymaiLzg5KdCXlKLjvcW893&#10;SUOqXwnz5DrgnHtJTxOsQfEKIT7DmDSUCaxw7Rqn8787ZsmRM9e2VmPeBN4uqYvTtW7jvijg9N/y&#10;JsXecLq0q+WD6m8AAAD//wMAUEsDBBQABgAIAAAAIQA4/SH/1gAAAJQBAAALAAAAX3JlbHMvLnJl&#10;bHOkkMFqwzAMhu+DvYPRfXGawxijTi+j0GvpHsDYimMaW0Yy2fr2M4PBMnrbUb/Q94l/f/hMi1qR&#10;JVI2sOt6UJgd+ZiDgffL8ekFlFSbvV0oo4EbChzGx4f9GRdb25HMsYhqlCwG5lrLq9biZkxWOiqY&#10;22YiTra2kYMu1l1tQD30/bPm3wwYN0x18gb45AdQl1tp5j/sFB2T0FQ7R0nTNEV3j6o9feQzro1i&#10;OWA14Fm+Q8a1a8+Bvu/d/dMb2JY5uiPbhG/ktn4cqGU/er3pcvwCAAD//wMAUEsDBBQABgAIAAAA&#10;IQCOGt2dzwEAAAMEAAAOAAAAZHJzL2Uyb0RvYy54bWysU8FuEzEQvSPxD5bvZJOUomqVTQ+pygVB&#10;ROkHuN5x1pLtscYm2fw9YyfZVICEQFy8O/a8N/Oex6v70TuxB0oWQycXs7kUEDT2Nuw6+fzt8d2d&#10;FCmr0CuHATp5hCTv12/frA6xhSUO6HogwSQhtYfYySHn2DZN0gN4lWYYIfChQfIqc0i7pid1YHbv&#10;muV8/qE5IPWRUENKvPtwOpTrym8M6PzFmARZuE5yb7muVNeXsjbrlWp3pOJg9bkN9Q9deGUDF52o&#10;HlRW4jvZX6i81YQJTZ5p9A0aYzVUDaxmMf9JzdOgIlQtbE6Kk03p/9Hqz/stCdt38laKoDxf0VMm&#10;ZXdDFhsMgQ1EErfFp0NMLadvwpbOUYpbKqJHQ758WY4Yq7fHyVsYs9C8uXi/vFne3UihL2fNFRgp&#10;5Y+AXpSfTjobimzVqv2nlLkYp15SyrYLZU3obP9onatBGRjYOBJ7xVedx0VpmXGvsjgqyKYIObVe&#10;//LRwYn1Kxi2ojRbq9chvHIqrSHkC68LnF1ghjuYgPM/A8/5BQp1QP8GPCFqZQx5AnsbkH5X/WqF&#10;OeVfHDjpLha8YH+sl1qt4Umrzp1fRRnl13GFX9/u+gcAAAD//wMAUEsDBBQABgAIAAAAIQDef/a0&#10;3gAAAAgBAAAPAAAAZHJzL2Rvd25yZXYueG1sTI9BS8NAEIXvgv9hGcGL2I3RriVmUyTQiwfBRorH&#10;bTLNBrOzIbtt0n/viId6nPceb76Xr2fXixOOofOk4WGRgECqfdNRq+Gz2tyvQIRoqDG9J9RwxgDr&#10;4voqN1njJ/rA0za2gksoZEaDjXHIpAy1RWfCwg9I7B386Ezkc2xlM5qJy10v0yRR0pmO+IM1A5YW&#10;6+/t0Wn4au8eN7uKqqmM7wdl5/PubVlqfXszv76AiDjHSxh+8RkdCmba+yM1QfQaVPrESdbVMwj2&#10;05Vagtj/CbLI5f8BxQ8AAAD//wMAUEsBAi0AFAAGAAgAAAAhALaDOJL+AAAA4QEAABMAAAAAAAAA&#10;AAAAAAAAAAAAAFtDb250ZW50X1R5cGVzXS54bWxQSwECLQAUAAYACAAAACEAOP0h/9YAAACUAQAA&#10;CwAAAAAAAAAAAAAAAAAvAQAAX3JlbHMvLnJlbHNQSwECLQAUAAYACAAAACEAjhrdnc8BAAADBAAA&#10;DgAAAAAAAAAAAAAAAAAuAgAAZHJzL2Uyb0RvYy54bWxQSwECLQAUAAYACAAAACEA3n/2tN4AAAAI&#10;AQAADwAAAAAAAAAAAAAAAAApBAAAZHJzL2Rvd25yZXYueG1sUEsFBgAAAAAEAAQA8wAAADQFAAAA&#10;AA==&#10;" strokecolor="black [3213]" strokeweight=".5pt">
+                          <v:line w14:anchorId="72701CAB" id="Straight Connector 5" o:spid="_x0000_s1026" style="position:absolute;z-index:251684864;visibility:visible;mso-wrap-style:square;mso-wrap-distance-left:9pt;mso-wrap-distance-top:0;mso-wrap-distance-right:9pt;mso-wrap-distance-bottom:0;mso-position-horizontal:absolute;mso-position-horizontal-relative:text;mso-position-vertical:absolute;mso-position-vertical-relative:text" from="31.2pt,8.35pt" to="143.25pt,8.35pt" o:gfxdata="UEsDBBQABgAIAAAAIQC2gziS/gAAAOEBAAATAAAAW0NvbnRlbnRfVHlwZXNdLnhtbJSRQU7DMBBF&#10;90jcwfIWJU67QAgl6YK0S0CoHGBkTxKLZGx5TGhvj5O2G0SRWNoz/78nu9wcxkFMGNg6quQqL6RA&#10;0s5Y6ir5vt9lD1JwBDIwOMJKHpHlpr69KfdHjyxSmriSfYz+USnWPY7AufNIadK6MEJMx9ApD/oD&#10;OlTrorhX2lFEilmcO2RdNtjC5xDF9pCuTyYBB5bi6bQ4syoJ3g9WQ0ymaiLzg5KdCXlKLjvcW893&#10;SUOqXwnz5DrgnHtJTxOsQfEKIT7DmDSUCaxw7Rqn8787ZsmRM9e2VmPeBN4uqYvTtW7jvijg9N/y&#10;JsXecLq0q+WD6m8AAAD//wMAUEsDBBQABgAIAAAAIQA4/SH/1gAAAJQBAAALAAAAX3JlbHMvLnJl&#10;bHOkkMFqwzAMhu+DvYPRfXGawxijTi+j0GvpHsDYimMaW0Yy2fr2M4PBMnrbUb/Q94l/f/hMi1qR&#10;JVI2sOt6UJgd+ZiDgffL8ekFlFSbvV0oo4EbChzGx4f9GRdb25HMsYhqlCwG5lrLq9biZkxWOiqY&#10;22YiTra2kYMu1l1tQD30/bPm3wwYN0x18gb45AdQl1tp5j/sFB2T0FQ7R0nTNEV3j6o9feQzro1i&#10;OWA14Fm+Q8a1a8+Bvu/d/dMb2JY5uiPbhG/ktn4cqGU/er3pcvwCAAD//wMAUEsDBBQABgAIAAAA&#10;IQCOGt2dzwEAAAMEAAAOAAAAZHJzL2Uyb0RvYy54bWysU8FuEzEQvSPxD5bvZJOUomqVTQ+pygVB&#10;ROkHuN5x1pLtscYm2fw9YyfZVICEQFy8O/a8N/Oex6v70TuxB0oWQycXs7kUEDT2Nuw6+fzt8d2d&#10;FCmr0CuHATp5hCTv12/frA6xhSUO6HogwSQhtYfYySHn2DZN0gN4lWYYIfChQfIqc0i7pid1YHbv&#10;muV8/qE5IPWRUENKvPtwOpTrym8M6PzFmARZuE5yb7muVNeXsjbrlWp3pOJg9bkN9Q9deGUDF52o&#10;HlRW4jvZX6i81YQJTZ5p9A0aYzVUDaxmMf9JzdOgIlQtbE6Kk03p/9Hqz/stCdt38laKoDxf0VMm&#10;ZXdDFhsMgQ1EErfFp0NMLadvwpbOUYpbKqJHQ758WY4Yq7fHyVsYs9C8uXi/vFne3UihL2fNFRgp&#10;5Y+AXpSfTjobimzVqv2nlLkYp15SyrYLZU3obP9onatBGRjYOBJ7xVedx0VpmXGvsjgqyKYIObVe&#10;//LRwYn1Kxi2ojRbq9chvHIqrSHkC68LnF1ghjuYgPM/A8/5BQp1QP8GPCFqZQx5AnsbkH5X/WqF&#10;OeVfHDjpLha8YH+sl1qt4Umrzp1fRRnl13GFX9/u+gcAAAD//wMAUEsDBBQABgAIAAAAIQDef/a0&#10;3gAAAAgBAAAPAAAAZHJzL2Rvd25yZXYueG1sTI9BS8NAEIXvgv9hGcGL2I3RriVmUyTQiwfBRorH&#10;bTLNBrOzIbtt0n/viId6nPceb76Xr2fXixOOofOk4WGRgECqfdNRq+Gz2tyvQIRoqDG9J9RwxgDr&#10;4voqN1njJ/rA0za2gksoZEaDjXHIpAy1RWfCwg9I7B386Ezkc2xlM5qJy10v0yRR0pmO+IM1A5YW&#10;6+/t0Wn4au8eN7uKqqmM7wdl5/PubVlqfXszv76AiDjHSxh+8RkdCmba+yM1QfQaVPrESdbVMwj2&#10;05Vagtj/CbLI5f8BxQ8AAAD//wMAUEsBAi0AFAAGAAgAAAAhALaDOJL+AAAA4QEAABMAAAAAAAAA&#10;AAAAAAAAAAAAAFtDb250ZW50X1R5cGVzXS54bWxQSwECLQAUAAYACAAAACEAOP0h/9YAAACUAQAA&#10;CwAAAAAAAAAAAAAAAAAvAQAAX3JlbHMvLnJlbHNQSwECLQAUAAYACAAAACEAjhrdnc8BAAADBAAA&#10;DgAAAAAAAAAAAAAAAAAuAgAAZHJzL2Uyb0RvYy54bWxQSwECLQAUAAYACAAAACEA3n/2tN4AAAAI&#10;AQAADwAAAAAAAAAAAAAAAAApBAAAZHJzL2Rvd25yZXYueG1sUEsFBgAAAAAEAAQA8wAAADQFAAAA&#10;AA==&#10;" strokecolor="black [3213]" strokeweight=".5pt">
                             <v:stroke joinstyle="miter"/>
                           </v:line>
                         </w:pict>
@@ -2538,7 +2476,6 @@
                     </w:rPr>
                     <w:t xml:space="preserve">           {</w:t>
                   </w:r>
-                  <w:proofErr w:type="spellStart"/>
                   <w:r>
                     <w:rPr>
                       <w:rFonts w:ascii="Tahoma" w:hAnsi="Tahoma" w:cs="Tahoma"/>
@@ -2549,7 +2486,6 @@
                     </w:rPr>
                     <w:t>AuthorizedByName</w:t>
                   </w:r>
-                  <w:proofErr w:type="spellEnd"/>
                   <w:r>
                     <w:rPr>
                       <w:rFonts w:ascii="Tahoma" w:eastAsia="Arial" w:hAnsi="Tahoma" w:cs="Tahoma"/>
@@ -2735,12 +2671,8 @@
       </w:pPr>
     </w:p>
     <w:sectPr>
-      <w:headerReference w:type="even" r:id="rId8"/>
-      <w:headerReference w:type="default" r:id="rId9"/>
-      <w:footerReference w:type="even" r:id="rId10"/>
-      <w:footerReference w:type="default" r:id="rId11"/>
-      <w:headerReference w:type="first" r:id="rId12"/>
-      <w:footerReference w:type="first" r:id="rId13"/>
+      <w:headerReference w:type="default" r:id="rId8"/>
+      <w:footerReference w:type="default" r:id="rId9"/>
       <w:pgSz w:w="20160" w:h="12240" w:orient="landscape" w:code="5"/>
       <w:pgMar w:top="1800" w:right="1440" w:bottom="1800" w:left="1440" w:header="0" w:footer="0" w:gutter="0"/>
       <w:cols w:space="720"/>
@@ -2754,9 +2686,6 @@
 <w:endnotes xmlns:wpc="http://schemas.microsoft.com/office/word/2010/wordprocessingCanvas" xmlns:cx="http://schemas.microsoft.com/office/drawing/2014/chartex" xmlns:cx1="http://schemas.microsoft.com/office/drawing/2015/9/8/chartex" xmlns:cx2="http://schemas.microsoft.com/office/drawing/2015/10/21/chartex" xmlns:cx3="http://schemas.microsoft.com/office/drawing/2016/5/9/chartex" xmlns:cx4="http://schemas.microsoft.com/office/drawing/2016/5/10/chartex" xmlns:cx5="http://schemas.microsoft.com/office/drawing/2016/5/11/chartex" xmlns:cx6="http://schemas.microsoft.com/office/drawing/2016/5/12/chartex" xmlns:cx7="http://schemas.microsoft.com/office/drawing/2016/5/13/chartex" xmlns:cx8="http://schemas.microsoft.com/office/drawing/2016/5/14/chartex" xmlns:mc="http://schemas.openxmlformats.org/markup-compatibility/2006" xmlns:aink="http://schemas.microsoft.com/office/drawing/2016/ink" xmlns:am3d="http://schemas.microsoft.com/office/drawing/2017/model3d" xmlns:o="urn:schemas-microsoft-com:office:office" xmlns:r="http://schemas.openxmlformats.org/officeDocument/2006/relationships" xmlns:m="http://schemas.openxmlformats.org/officeDocument/2006/math" xmlns:v="urn:schemas-microsoft-com:vml" xmlns:wp14="http://schemas.microsoft.com/office/word/2010/wordprocessingDrawing" xmlns:wp="http://schemas.openxmlformats.org/drawingml/2006/wordprocessingDrawing" xmlns:w10="urn:schemas-microsoft-com:office:word" xmlns:w="http://schemas.openxmlformats.org/wordprocessingml/2006/main" xmlns:w14="http://schemas.microsoft.com/office/word/2010/wordml" xmlns:w15="http://schemas.microsoft.com/office/word/2012/wordml" xmlns:w16cex="http://schemas.microsoft.com/office/word/2018/wordml/cex" xmlns:w16cid="http://schemas.microsoft.com/office/word/2016/wordml/cid" xmlns:w16="http://schemas.microsoft.com/office/word/2018/wordml" xmlns:w16sdtdh="http://schemas.microsoft.com/office/word/2020/wordml/sdtdatahash" xmlns:w16se="http://schemas.microsoft.com/office/word/2015/wordml/symex" xmlns:wpg="http://schemas.microsoft.com/office/word/2010/wordprocessingGroup" xmlns:wpi="http://schemas.microsoft.com/office/word/2010/wordprocessingInk" xmlns:wne="http://schemas.microsoft.com/office/word/2006/wordml" xmlns:wps="http://schemas.microsoft.com/office/word/2010/wordprocessingShape" mc:Ignorable="w14 w15 w16se w16cid w16 w16cex w16sdtdh wp14">
   <w:endnote w:type="separator" w:id="-1">
     <w:p>
-      <w:pPr>
-        <w:spacing w:after="0" w:line="240" w:lineRule="auto"/>
-      </w:pPr>
       <w:r>
         <w:separator/>
       </w:r>
@@ -2764,9 +2693,6 @@
   </w:endnote>
   <w:endnote w:type="continuationSeparator" w:id="0">
     <w:p>
-      <w:pPr>
-        <w:spacing w:after="0" w:line="240" w:lineRule="auto"/>
-      </w:pPr>
       <w:r>
         <w:continuationSeparator/>
       </w:r>
@@ -2776,16 +2702,6 @@
 </file>
 
 <file path=word/footer1.xml><?xml version="1.0" encoding="utf-8"?>
-<w:ftr xmlns:wpc="http://schemas.microsoft.com/office/word/2010/wordprocessingCanvas" xmlns:cx="http://schemas.microsoft.com/office/drawing/2014/chartex" xmlns:cx1="http://schemas.microsoft.com/office/drawing/2015/9/8/chartex" xmlns:cx2="http://schemas.microsoft.com/office/drawing/2015/10/21/chartex" xmlns:cx3="http://schemas.microsoft.com/office/drawing/2016/5/9/chartex" xmlns:cx4="http://schemas.microsoft.com/office/drawing/2016/5/10/chartex" xmlns:cx5="http://schemas.microsoft.com/office/drawing/2016/5/11/chartex" xmlns:cx6="http://schemas.microsoft.com/office/drawing/2016/5/12/chartex" xmlns:cx7="http://schemas.microsoft.com/office/drawing/2016/5/13/chartex" xmlns:cx8="http://schemas.microsoft.com/office/drawing/2016/5/14/chartex" xmlns:mc="http://schemas.openxmlformats.org/markup-compatibility/2006" xmlns:aink="http://schemas.microsoft.com/office/drawing/2016/ink" xmlns:am3d="http://schemas.microsoft.com/office/drawing/2017/model3d" xmlns:o="urn:schemas-microsoft-com:office:office" xmlns:r="http://schemas.openxmlformats.org/officeDocument/2006/relationships" xmlns:m="http://schemas.openxmlformats.org/officeDocument/2006/math" xmlns:v="urn:schemas-microsoft-com:vml" xmlns:wp14="http://schemas.microsoft.com/office/word/2010/wordprocessingDrawing" xmlns:wp="http://schemas.openxmlformats.org/drawingml/2006/wordprocessingDrawing" xmlns:w10="urn:schemas-microsoft-com:office:word" xmlns:w="http://schemas.openxmlformats.org/wordprocessingml/2006/main" xmlns:w14="http://schemas.microsoft.com/office/word/2010/wordml" xmlns:w15="http://schemas.microsoft.com/office/word/2012/wordml" xmlns:w16cex="http://schemas.microsoft.com/office/word/2018/wordml/cex" xmlns:w16cid="http://schemas.microsoft.com/office/word/2016/wordml/cid" xmlns:w16="http://schemas.microsoft.com/office/word/2018/wordml" xmlns:w16sdtdh="http://schemas.microsoft.com/office/word/2020/wordml/sdtdatahash" xmlns:w16se="http://schemas.microsoft.com/office/word/2015/wordml/symex" xmlns:wpg="http://schemas.microsoft.com/office/word/2010/wordprocessingGroup" xmlns:wpi="http://schemas.microsoft.com/office/word/2010/wordprocessingInk" xmlns:wne="http://schemas.microsoft.com/office/word/2006/wordml" xmlns:wps="http://schemas.microsoft.com/office/word/2010/wordprocessingShape" mc:Ignorable="w14 w15 w16se w16cid w16 w16cex w16sdtdh wp14">
-  <w:p>
-    <w:pPr>
-      <w:pStyle w:val="Footer"/>
-    </w:pPr>
-  </w:p>
-</w:ftr>
-</file>
-
-<file path=word/footer2.xml><?xml version="1.0" encoding="utf-8"?>
 <w:ftr xmlns:wpc="http://schemas.microsoft.com/office/word/2010/wordprocessingCanvas" xmlns:cx="http://schemas.microsoft.com/office/drawing/2014/chartex" xmlns:cx1="http://schemas.microsoft.com/office/drawing/2015/9/8/chartex" xmlns:cx2="http://schemas.microsoft.com/office/drawing/2015/10/21/chartex" xmlns:cx3="http://schemas.microsoft.com/office/drawing/2016/5/9/chartex" xmlns:cx4="http://schemas.microsoft.com/office/drawing/2016/5/10/chartex" xmlns:cx5="http://schemas.microsoft.com/office/drawing/2016/5/11/chartex" xmlns:cx6="http://schemas.microsoft.com/office/drawing/2016/5/12/chartex" xmlns:cx7="http://schemas.microsoft.com/office/drawing/2016/5/13/chartex" xmlns:cx8="http://schemas.microsoft.com/office/drawing/2016/5/14/chartex" xmlns:mc="http://schemas.openxmlformats.org/markup-compatibility/2006" xmlns:aink="http://schemas.microsoft.com/office/drawing/2016/ink" xmlns:am3d="http://schemas.microsoft.com/office/drawing/2017/model3d" xmlns:o="urn:schemas-microsoft-com:office:office" xmlns:r="http://schemas.openxmlformats.org/officeDocument/2006/relationships" xmlns:m="http://schemas.openxmlformats.org/officeDocument/2006/math" xmlns:v="urn:schemas-microsoft-com:vml" xmlns:wp14="http://schemas.microsoft.com/office/word/2010/wordprocessingDrawing" xmlns:wp="http://schemas.openxmlformats.org/drawingml/2006/wordprocessingDrawing" xmlns:w10="urn:schemas-microsoft-com:office:word" xmlns:w="http://schemas.openxmlformats.org/wordprocessingml/2006/main" xmlns:w14="http://schemas.microsoft.com/office/word/2010/wordml" xmlns:w15="http://schemas.microsoft.com/office/word/2012/wordml" xmlns:w16cex="http://schemas.microsoft.com/office/word/2018/wordml/cex" xmlns:w16cid="http://schemas.microsoft.com/office/word/2016/wordml/cid" xmlns:w16="http://schemas.microsoft.com/office/word/2018/wordml" xmlns:w16sdtdh="http://schemas.microsoft.com/office/word/2020/wordml/sdtdatahash" xmlns:w16se="http://schemas.microsoft.com/office/word/2015/wordml/symex" xmlns:wpg="http://schemas.microsoft.com/office/word/2010/wordprocessingGroup" xmlns:wpi="http://schemas.microsoft.com/office/word/2010/wordprocessingInk" xmlns:wne="http://schemas.microsoft.com/office/word/2006/wordml" xmlns:wps="http://schemas.microsoft.com/office/word/2010/wordprocessingShape" mc:Ignorable="w14 w15 w16se w16cid w16 w16cex w16sdtdh wp14">
   <w:sdt>
     <w:sdtPr>
@@ -2832,7 +2748,6 @@
   </w:sdt>
   <w:p>
     <w:pPr>
-      <w:spacing w:after="0"/>
       <w:jc w:val="center"/>
       <w:rPr>
         <w:rFonts w:ascii="Tahoma" w:hAnsi="Tahoma" w:cs="Tahoma"/>
@@ -2846,126 +2761,8 @@
         <w:sz w:val="16"/>
         <w:szCs w:val="16"/>
       </w:rPr>
-      <w:t xml:space="preserve">Mouza: </w:t>
+      <w:t>Mouza: Depashai, U.P: Sombag, Kalampur, P.S: Dhamrai District: Dhaka, Bangladesh.Web: www.ocl-bd.com Phone: +8809612223355</w:t>
     </w:r>
-    <w:proofErr w:type="spellStart"/>
-    <w:r>
-      <w:rPr>
-        <w:rFonts w:ascii="Tahoma" w:hAnsi="Tahoma" w:cs="Tahoma"/>
-        <w:sz w:val="16"/>
-        <w:szCs w:val="16"/>
-      </w:rPr>
-      <w:t>Depashai</w:t>
-    </w:r>
-    <w:proofErr w:type="spellEnd"/>
-    <w:r>
-      <w:rPr>
-        <w:rFonts w:ascii="Tahoma" w:hAnsi="Tahoma" w:cs="Tahoma"/>
-        <w:sz w:val="16"/>
-        <w:szCs w:val="16"/>
-      </w:rPr>
-      <w:t xml:space="preserve">, </w:t>
-    </w:r>
-    <w:proofErr w:type="gramStart"/>
-    <w:r>
-      <w:rPr>
-        <w:rFonts w:ascii="Tahoma" w:hAnsi="Tahoma" w:cs="Tahoma"/>
-        <w:sz w:val="16"/>
-        <w:szCs w:val="16"/>
-      </w:rPr>
-      <w:t>U.P</w:t>
-    </w:r>
-    <w:proofErr w:type="gramEnd"/>
-    <w:r>
-      <w:rPr>
-        <w:rFonts w:ascii="Tahoma" w:hAnsi="Tahoma" w:cs="Tahoma"/>
-        <w:sz w:val="16"/>
-        <w:szCs w:val="16"/>
-      </w:rPr>
-      <w:t xml:space="preserve">: </w:t>
-    </w:r>
-    <w:proofErr w:type="spellStart"/>
-    <w:r>
-      <w:rPr>
-        <w:rFonts w:ascii="Tahoma" w:hAnsi="Tahoma" w:cs="Tahoma"/>
-        <w:sz w:val="16"/>
-        <w:szCs w:val="16"/>
-      </w:rPr>
-      <w:t>Sombag</w:t>
-    </w:r>
-    <w:proofErr w:type="spellEnd"/>
-    <w:r>
-      <w:rPr>
-        <w:rFonts w:ascii="Tahoma" w:hAnsi="Tahoma" w:cs="Tahoma"/>
-        <w:sz w:val="16"/>
-        <w:szCs w:val="16"/>
-      </w:rPr>
-      <w:t xml:space="preserve">, </w:t>
-    </w:r>
-    <w:proofErr w:type="spellStart"/>
-    <w:r>
-      <w:rPr>
-        <w:rFonts w:ascii="Tahoma" w:hAnsi="Tahoma" w:cs="Tahoma"/>
-        <w:sz w:val="16"/>
-        <w:szCs w:val="16"/>
-      </w:rPr>
-      <w:t>Kalampur</w:t>
-    </w:r>
-    <w:proofErr w:type="spellEnd"/>
-    <w:r>
-      <w:rPr>
-        <w:rFonts w:ascii="Tahoma" w:hAnsi="Tahoma" w:cs="Tahoma"/>
-        <w:sz w:val="16"/>
-        <w:szCs w:val="16"/>
-      </w:rPr>
-      <w:t xml:space="preserve">, P.S: </w:t>
-    </w:r>
-    <w:proofErr w:type="spellStart"/>
-    <w:r>
-      <w:rPr>
-        <w:rFonts w:ascii="Tahoma" w:hAnsi="Tahoma" w:cs="Tahoma"/>
-        <w:sz w:val="16"/>
-        <w:szCs w:val="16"/>
-      </w:rPr>
-      <w:t>Dhamrai</w:t>
-    </w:r>
-    <w:proofErr w:type="spellEnd"/>
-    <w:r>
-      <w:rPr>
-        <w:rFonts w:ascii="Tahoma" w:hAnsi="Tahoma" w:cs="Tahoma"/>
-        <w:sz w:val="16"/>
-        <w:szCs w:val="16"/>
-      </w:rPr>
-      <w:t xml:space="preserve"> District: Dhaka, </w:t>
-    </w:r>
-    <w:proofErr w:type="spellStart"/>
-    <w:r>
-      <w:rPr>
-        <w:rFonts w:ascii="Tahoma" w:hAnsi="Tahoma" w:cs="Tahoma"/>
-        <w:sz w:val="16"/>
-        <w:szCs w:val="16"/>
-      </w:rPr>
-      <w:t>Bangladesh.Web</w:t>
-    </w:r>
-    <w:proofErr w:type="spellEnd"/>
-    <w:r>
-      <w:rPr>
-        <w:rFonts w:ascii="Tahoma" w:hAnsi="Tahoma" w:cs="Tahoma"/>
-        <w:sz w:val="16"/>
-        <w:szCs w:val="16"/>
-      </w:rPr>
-      <w:t>: www.ocl-bd.com Phone: +8809612223355</w:t>
-    </w:r>
-  </w:p>
-</w:ftr>
-</file>
-
-<file path=word/footer3.xml><?xml version="1.0" encoding="utf-8"?>
-<w:ftr xmlns:wpc="http://schemas.microsoft.com/office/word/2010/wordprocessingCanvas" xmlns:cx="http://schemas.microsoft.com/office/drawing/2014/chartex" xmlns:cx1="http://schemas.microsoft.com/office/drawing/2015/9/8/chartex" xmlns:cx2="http://schemas.microsoft.com/office/drawing/2015/10/21/chartex" xmlns:cx3="http://schemas.microsoft.com/office/drawing/2016/5/9/chartex" xmlns:cx4="http://schemas.microsoft.com/office/drawing/2016/5/10/chartex" xmlns:cx5="http://schemas.microsoft.com/office/drawing/2016/5/11/chartex" xmlns:cx6="http://schemas.microsoft.com/office/drawing/2016/5/12/chartex" xmlns:cx7="http://schemas.microsoft.com/office/drawing/2016/5/13/chartex" xmlns:cx8="http://schemas.microsoft.com/office/drawing/2016/5/14/chartex" xmlns:mc="http://schemas.openxmlformats.org/markup-compatibility/2006" xmlns:aink="http://schemas.microsoft.com/office/drawing/2016/ink" xmlns:am3d="http://schemas.microsoft.com/office/drawing/2017/model3d" xmlns:o="urn:schemas-microsoft-com:office:office" xmlns:r="http://schemas.openxmlformats.org/officeDocument/2006/relationships" xmlns:m="http://schemas.openxmlformats.org/officeDocument/2006/math" xmlns:v="urn:schemas-microsoft-com:vml" xmlns:wp14="http://schemas.microsoft.com/office/word/2010/wordprocessingDrawing" xmlns:wp="http://schemas.openxmlformats.org/drawingml/2006/wordprocessingDrawing" xmlns:w10="urn:schemas-microsoft-com:office:word" xmlns:w="http://schemas.openxmlformats.org/wordprocessingml/2006/main" xmlns:w14="http://schemas.microsoft.com/office/word/2010/wordml" xmlns:w15="http://schemas.microsoft.com/office/word/2012/wordml" xmlns:w16cex="http://schemas.microsoft.com/office/word/2018/wordml/cex" xmlns:w16cid="http://schemas.microsoft.com/office/word/2016/wordml/cid" xmlns:w16="http://schemas.microsoft.com/office/word/2018/wordml" xmlns:w16sdtdh="http://schemas.microsoft.com/office/word/2020/wordml/sdtdatahash" xmlns:w16se="http://schemas.microsoft.com/office/word/2015/wordml/symex" xmlns:wpg="http://schemas.microsoft.com/office/word/2010/wordprocessingGroup" xmlns:wpi="http://schemas.microsoft.com/office/word/2010/wordprocessingInk" xmlns:wne="http://schemas.microsoft.com/office/word/2006/wordml" xmlns:wps="http://schemas.microsoft.com/office/word/2010/wordprocessingShape" mc:Ignorable="w14 w15 w16se w16cid w16 w16cex w16sdtdh wp14">
-  <w:p>
-    <w:pPr>
-      <w:pStyle w:val="Footer"/>
-    </w:pPr>
   </w:p>
 </w:ftr>
 </file>
@@ -2974,9 +2771,6 @@
 <w:footnotes xmlns:wpc="http://schemas.microsoft.com/office/word/2010/wordprocessingCanvas" xmlns:cx="http://schemas.microsoft.com/office/drawing/2014/chartex" xmlns:cx1="http://schemas.microsoft.com/office/drawing/2015/9/8/chartex" xmlns:cx2="http://schemas.microsoft.com/office/drawing/2015/10/21/chartex" xmlns:cx3="http://schemas.microsoft.com/office/drawing/2016/5/9/chartex" xmlns:cx4="http://schemas.microsoft.com/office/drawing/2016/5/10/chartex" xmlns:cx5="http://schemas.microsoft.com/office/drawing/2016/5/11/chartex" xmlns:cx6="http://schemas.microsoft.com/office/drawing/2016/5/12/chartex" xmlns:cx7="http://schemas.microsoft.com/office/drawing/2016/5/13/chartex" xmlns:cx8="http://schemas.microsoft.com/office/drawing/2016/5/14/chartex" xmlns:mc="http://schemas.openxmlformats.org/markup-compatibility/2006" xmlns:aink="http://schemas.microsoft.com/office/drawing/2016/ink" xmlns:am3d="http://schemas.microsoft.com/office/drawing/2017/model3d" xmlns:o="urn:schemas-microsoft-com:office:office" xmlns:r="http://schemas.openxmlformats.org/officeDocument/2006/relationships" xmlns:m="http://schemas.openxmlformats.org/officeDocument/2006/math" xmlns:v="urn:schemas-microsoft-com:vml" xmlns:wp14="http://schemas.microsoft.com/office/word/2010/wordprocessingDrawing" xmlns:wp="http://schemas.openxmlformats.org/drawingml/2006/wordprocessingDrawing" xmlns:w10="urn:schemas-microsoft-com:office:word" xmlns:w="http://schemas.openxmlformats.org/wordprocessingml/2006/main" xmlns:w14="http://schemas.microsoft.com/office/word/2010/wordml" xmlns:w15="http://schemas.microsoft.com/office/word/2012/wordml" xmlns:w16cex="http://schemas.microsoft.com/office/word/2018/wordml/cex" xmlns:w16cid="http://schemas.microsoft.com/office/word/2016/wordml/cid" xmlns:w16="http://schemas.microsoft.com/office/word/2018/wordml" xmlns:w16sdtdh="http://schemas.microsoft.com/office/word/2020/wordml/sdtdatahash" xmlns:w16se="http://schemas.microsoft.com/office/word/2015/wordml/symex" xmlns:wpg="http://schemas.microsoft.com/office/word/2010/wordprocessingGroup" xmlns:wpi="http://schemas.microsoft.com/office/word/2010/wordprocessingInk" xmlns:wne="http://schemas.microsoft.com/office/word/2006/wordml" xmlns:wps="http://schemas.microsoft.com/office/word/2010/wordprocessingShape" mc:Ignorable="w14 w15 w16se w16cid w16 w16cex w16sdtdh wp14">
   <w:footnote w:type="separator" w:id="-1">
     <w:p>
-      <w:pPr>
-        <w:spacing w:after="0" w:line="240" w:lineRule="auto"/>
-      </w:pPr>
       <w:r>
         <w:separator/>
       </w:r>
@@ -2984,9 +2778,6 @@
   </w:footnote>
   <w:footnote w:type="continuationSeparator" w:id="0">
     <w:p>
-      <w:pPr>
-        <w:spacing w:after="0" w:line="240" w:lineRule="auto"/>
-      </w:pPr>
       <w:r>
         <w:continuationSeparator/>
       </w:r>
@@ -3000,17 +2791,9 @@
   <w:p>
     <w:pPr>
       <w:pStyle w:val="Header"/>
-    </w:pPr>
-  </w:p>
-</w:hdr>
-</file>
-
-<file path=word/header2.xml><?xml version="1.0" encoding="utf-8"?>
-<w:hdr xmlns:wpc="http://schemas.microsoft.com/office/word/2010/wordprocessingCanvas" xmlns:cx="http://schemas.microsoft.com/office/drawing/2014/chartex" xmlns:cx1="http://schemas.microsoft.com/office/drawing/2015/9/8/chartex" xmlns:cx2="http://schemas.microsoft.com/office/drawing/2015/10/21/chartex" xmlns:cx3="http://schemas.microsoft.com/office/drawing/2016/5/9/chartex" xmlns:cx4="http://schemas.microsoft.com/office/drawing/2016/5/10/chartex" xmlns:cx5="http://schemas.microsoft.com/office/drawing/2016/5/11/chartex" xmlns:cx6="http://schemas.microsoft.com/office/drawing/2016/5/12/chartex" xmlns:cx7="http://schemas.microsoft.com/office/drawing/2016/5/13/chartex" xmlns:cx8="http://schemas.microsoft.com/office/drawing/2016/5/14/chartex" xmlns:mc="http://schemas.openxmlformats.org/markup-compatibility/2006" xmlns:aink="http://schemas.microsoft.com/office/drawing/2016/ink" xmlns:am3d="http://schemas.microsoft.com/office/drawing/2017/model3d" xmlns:o="urn:schemas-microsoft-com:office:office" xmlns:r="http://schemas.openxmlformats.org/officeDocument/2006/relationships" xmlns:m="http://schemas.openxmlformats.org/officeDocument/2006/math" xmlns:v="urn:schemas-microsoft-com:vml" xmlns:wp14="http://schemas.microsoft.com/office/word/2010/wordprocessingDrawing" xmlns:wp="http://schemas.openxmlformats.org/drawingml/2006/wordprocessingDrawing" xmlns:w10="urn:schemas-microsoft-com:office:word" xmlns:w="http://schemas.openxmlformats.org/wordprocessingml/2006/main" xmlns:w14="http://schemas.microsoft.com/office/word/2010/wordml" xmlns:w15="http://schemas.microsoft.com/office/word/2012/wordml" xmlns:w16cex="http://schemas.microsoft.com/office/word/2018/wordml/cex" xmlns:w16cid="http://schemas.microsoft.com/office/word/2016/wordml/cid" xmlns:w16="http://schemas.microsoft.com/office/word/2018/wordml" xmlns:w16sdtdh="http://schemas.microsoft.com/office/word/2020/wordml/sdtdatahash" xmlns:w16se="http://schemas.microsoft.com/office/word/2015/wordml/symex" xmlns:wpg="http://schemas.microsoft.com/office/word/2010/wordprocessingGroup" xmlns:wpi="http://schemas.microsoft.com/office/word/2010/wordprocessingInk" xmlns:wne="http://schemas.microsoft.com/office/word/2006/wordml" xmlns:wps="http://schemas.microsoft.com/office/word/2010/wordprocessingShape" mc:Ignorable="w14 w15 w16se w16cid w16 w16cex w16sdtdh wp14">
-  <w:p>
-    <w:pPr>
-      <w:pStyle w:val="Header"/>
-      <w:jc w:val="right"/>
+      <w:tabs>
+        <w:tab w:val="left" w:pos="556"/>
+      </w:tabs>
     </w:pPr>
     <w:r>
       <w:rPr>
@@ -3020,18 +2803,18 @@
       <mc:AlternateContent>
         <mc:Choice Requires="wps">
           <w:drawing>
-            <wp:anchor distT="0" distB="0" distL="114300" distR="114300" simplePos="0" relativeHeight="251659264" behindDoc="0" locked="0" layoutInCell="1" allowOverlap="1" wp14:anchorId="1CC9E2F8" wp14:editId="2DE0DF18">
+            <wp:anchor distT="0" distB="0" distL="114300" distR="114300" simplePos="0" relativeHeight="251661312" behindDoc="0" locked="0" layoutInCell="1" allowOverlap="1" wp14:anchorId="21FD6A98" wp14:editId="11EF0431">
               <wp:simplePos x="0" y="0"/>
               <wp:positionH relativeFrom="column">
-                <wp:posOffset>8458200</wp:posOffset>
+                <wp:posOffset>8908011</wp:posOffset>
               </wp:positionH>
               <wp:positionV relativeFrom="paragraph">
-                <wp:posOffset>104775</wp:posOffset>
+                <wp:posOffset>128154</wp:posOffset>
               </wp:positionV>
-              <wp:extent cx="2799715" cy="628650"/>
-              <wp:effectExtent l="0" t="0" r="19685" b="19050"/>
+              <wp:extent cx="2278380" cy="852054"/>
+              <wp:effectExtent l="0" t="0" r="26670" b="24765"/>
               <wp:wrapNone/>
-              <wp:docPr id="10" name="Rectangle 10"/>
+              <wp:docPr id="8" name="Rectangle 8"/>
               <wp:cNvGraphicFramePr/>
               <a:graphic xmlns:a="http://schemas.openxmlformats.org/drawingml/2006/main">
                 <a:graphicData uri="http://schemas.microsoft.com/office/word/2010/wordprocessingShape">
@@ -3040,7 +2823,7 @@
                     <wps:spPr>
                       <a:xfrm>
                         <a:off x="0" y="0"/>
-                        <a:ext cx="2799715" cy="628650"/>
+                        <a:ext cx="2278380" cy="852054"/>
                       </a:xfrm>
                       <a:prstGeom prst="rect">
                         <a:avLst/>
@@ -3069,6 +2852,139 @@
                       <w:txbxContent>
                         <w:p>
                           <w:pPr>
+                            <w:shd w:val="clear" w:color="auto" w:fill="FFFFFF"/>
+                            <w:jc w:val="right"/>
+                            <w:rPr>
+                              <w:rFonts w:ascii="Tahoma" w:eastAsia="Times New Roman" w:hAnsi="Tahoma" w:cs="Tahoma"/>
+                              <w:sz w:val="16"/>
+                              <w:szCs w:val="16"/>
+                            </w:rPr>
+                          </w:pPr>
+                          <w:r>
+                            <w:rPr>
+                              <w:rFonts w:ascii="Tahoma" w:eastAsia="Times New Roman" w:hAnsi="Tahoma" w:cs="Tahoma"/>
+                              <w:sz w:val="16"/>
+                              <w:szCs w:val="16"/>
+                            </w:rPr>
+                            <w:t>701, NRK Business Park, Vijay Nagar Square,</w:t>
+                          </w:r>
+                        </w:p>
+                        <w:p>
+                          <w:pPr>
+                            <w:shd w:val="clear" w:color="auto" w:fill="FFFFFF"/>
+                            <w:jc w:val="right"/>
+                            <w:rPr>
+                              <w:rFonts w:ascii="Tahoma" w:eastAsia="Times New Roman" w:hAnsi="Tahoma" w:cs="Tahoma"/>
+                              <w:sz w:val="16"/>
+                              <w:szCs w:val="16"/>
+                            </w:rPr>
+                          </w:pPr>
+                          <w:r>
+                            <w:rPr>
+                              <w:rFonts w:ascii="Tahoma" w:eastAsia="Times New Roman" w:hAnsi="Tahoma" w:cs="Tahoma"/>
+                              <w:sz w:val="16"/>
+                              <w:szCs w:val="16"/>
+                            </w:rPr>
+                            <w:t>Indore – 452010, Madhya Pradesh, India.</w:t>
+                          </w:r>
+                        </w:p>
+                        <w:p>
+                          <w:pPr>
+                            <w:shd w:val="clear" w:color="auto" w:fill="FFFFFF"/>
+                            <w:jc w:val="right"/>
+                            <w:rPr>
+                              <w:rFonts w:ascii="Tahoma" w:eastAsia="Times New Roman" w:hAnsi="Tahoma" w:cs="Tahoma"/>
+                              <w:sz w:val="16"/>
+                              <w:szCs w:val="16"/>
+                            </w:rPr>
+                          </w:pPr>
+                          <w:hyperlink r:id="rId1" w:tgtFrame="_blank" w:history="1">
+                            <w:r>
+                              <w:rPr>
+                                <w:rFonts w:ascii="Tahoma" w:eastAsia="Times New Roman" w:hAnsi="Tahoma" w:cs="Tahoma"/>
+                                <w:sz w:val="16"/>
+                                <w:szCs w:val="16"/>
+                              </w:rPr>
+                              <w:t>Tel: +91-731-4267900</w:t>
+                            </w:r>
+                          </w:hyperlink>
+                          <w:r>
+                            <w:rPr>
+                              <w:rFonts w:ascii="Tahoma" w:eastAsia="Times New Roman" w:hAnsi="Tahoma" w:cs="Tahoma"/>
+                              <w:sz w:val="16"/>
+                              <w:szCs w:val="16"/>
+                            </w:rPr>
+                            <w:t xml:space="preserve"> / 01</w:t>
+                          </w:r>
+                        </w:p>
+                        <w:p>
+                          <w:pPr>
+                            <w:shd w:val="clear" w:color="auto" w:fill="FFFFFF"/>
+                            <w:jc w:val="right"/>
+                            <w:rPr>
+                              <w:rFonts w:ascii="Tahoma" w:eastAsia="Times New Roman" w:hAnsi="Tahoma" w:cs="Tahoma"/>
+                              <w:color w:val="222222"/>
+                              <w:sz w:val="16"/>
+                              <w:szCs w:val="16"/>
+                            </w:rPr>
+                          </w:pPr>
+                          <w:r>
+                            <w:rPr>
+                              <w:rFonts w:ascii="Tahoma" w:eastAsia="Times New Roman" w:hAnsi="Tahoma" w:cs="Tahoma"/>
+                              <w:color w:val="222222"/>
+                              <w:sz w:val="16"/>
+                              <w:szCs w:val="16"/>
+                            </w:rPr>
+                            <w:t xml:space="preserve">Email: </w:t>
+                          </w:r>
+                          <w:r>
+                            <w:rPr>
+                              <w:rFonts w:ascii="Tahoma" w:eastAsia="Times New Roman" w:hAnsi="Tahoma" w:cs="Tahoma"/>
+                              <w:i/>
+                              <w:iCs/>
+                              <w:color w:val="4472C4" w:themeColor="accent1"/>
+                              <w:sz w:val="16"/>
+                              <w:szCs w:val="16"/>
+                            </w:rPr>
+                            <w:t>info@vasudhaswaraj.com</w:t>
+                          </w:r>
+                        </w:p>
+                        <w:p>
+                          <w:pPr>
+                            <w:shd w:val="clear" w:color="auto" w:fill="FFFFFF"/>
+                            <w:jc w:val="right"/>
+                            <w:rPr>
+                              <w:rFonts w:ascii="Tahoma" w:eastAsia="Times New Roman" w:hAnsi="Tahoma" w:cs="Tahoma"/>
+                              <w:color w:val="222222"/>
+                              <w:sz w:val="16"/>
+                              <w:szCs w:val="16"/>
+                            </w:rPr>
+                          </w:pPr>
+                          <w:r>
+                            <w:rPr>
+                              <w:rFonts w:ascii="Tahoma" w:eastAsia="Times New Roman" w:hAnsi="Tahoma" w:cs="Tahoma"/>
+                              <w:sz w:val="16"/>
+                              <w:szCs w:val="16"/>
+                            </w:rPr>
+                            <w:t>Website:</w:t>
+                          </w:r>
+                          <w:hyperlink r:id="rId2" w:history="1">
+                            <w:r>
+                              <w:rPr>
+                                <w:rStyle w:val="Hyperlink"/>
+                                <w:rFonts w:ascii="Tahoma" w:eastAsia="Times New Roman" w:hAnsi="Tahoma" w:cs="Tahoma"/>
+                                <w:i/>
+                                <w:iCs/>
+                                <w:sz w:val="16"/>
+                                <w:szCs w:val="16"/>
+                                <w:u w:val="none"/>
+                              </w:rPr>
+                              <w:t>www.vasudhaswaraj.com</w:t>
+                            </w:r>
+                          </w:hyperlink>
+                        </w:p>
+                        <w:p>
+                          <w:pPr>
                             <w:jc w:val="right"/>
                             <w:rPr>
                               <w:rFonts w:ascii="Tahoma" w:hAnsi="Tahoma" w:cs="Tahoma"/>
@@ -3076,122 +2992,6 @@
                               <w:szCs w:val="16"/>
                             </w:rPr>
                           </w:pPr>
-                          <w:r>
-                            <w:rPr>
-                              <w:rFonts w:ascii="Tahoma" w:hAnsi="Tahoma" w:cs="Tahoma"/>
-                              <w:sz w:val="16"/>
-                              <w:szCs w:val="16"/>
-                            </w:rPr>
-                            <w:t xml:space="preserve">Mouza: </w:t>
-                          </w:r>
-                          <w:proofErr w:type="spellStart"/>
-                          <w:r>
-                            <w:rPr>
-                              <w:rFonts w:ascii="Tahoma" w:hAnsi="Tahoma" w:cs="Tahoma"/>
-                              <w:sz w:val="16"/>
-                              <w:szCs w:val="16"/>
-                            </w:rPr>
-                            <w:t>Depashai</w:t>
-                          </w:r>
-                          <w:proofErr w:type="spellEnd"/>
-                          <w:r>
-                            <w:rPr>
-                              <w:rFonts w:ascii="Tahoma" w:hAnsi="Tahoma" w:cs="Tahoma"/>
-                              <w:sz w:val="16"/>
-                              <w:szCs w:val="16"/>
-                            </w:rPr>
-                            <w:t xml:space="preserve">, </w:t>
-                          </w:r>
-                          <w:proofErr w:type="gramStart"/>
-                          <w:r>
-                            <w:rPr>
-                              <w:rFonts w:ascii="Tahoma" w:hAnsi="Tahoma" w:cs="Tahoma"/>
-                              <w:sz w:val="16"/>
-                              <w:szCs w:val="16"/>
-                            </w:rPr>
-                            <w:t>U.P</w:t>
-                          </w:r>
-                          <w:proofErr w:type="gramEnd"/>
-                          <w:r>
-                            <w:rPr>
-                              <w:rFonts w:ascii="Tahoma" w:hAnsi="Tahoma" w:cs="Tahoma"/>
-                              <w:sz w:val="16"/>
-                              <w:szCs w:val="16"/>
-                            </w:rPr>
-                            <w:t xml:space="preserve">: </w:t>
-                          </w:r>
-                          <w:proofErr w:type="spellStart"/>
-                          <w:r>
-                            <w:rPr>
-                              <w:rFonts w:ascii="Tahoma" w:hAnsi="Tahoma" w:cs="Tahoma"/>
-                              <w:sz w:val="16"/>
-                              <w:szCs w:val="16"/>
-                            </w:rPr>
-                            <w:t>Sombag</w:t>
-                          </w:r>
-                          <w:proofErr w:type="spellEnd"/>
-                          <w:r>
-                            <w:rPr>
-                              <w:rFonts w:ascii="Tahoma" w:hAnsi="Tahoma" w:cs="Tahoma"/>
-                              <w:sz w:val="16"/>
-                              <w:szCs w:val="16"/>
-                            </w:rPr>
-                            <w:t xml:space="preserve">, </w:t>
-                          </w:r>
-                          <w:proofErr w:type="spellStart"/>
-                          <w:r>
-                            <w:rPr>
-                              <w:rFonts w:ascii="Tahoma" w:hAnsi="Tahoma" w:cs="Tahoma"/>
-                              <w:sz w:val="16"/>
-                              <w:szCs w:val="16"/>
-                            </w:rPr>
-                            <w:t>Kalampur</w:t>
-                          </w:r>
-                          <w:proofErr w:type="spellEnd"/>
-                          <w:r>
-                            <w:rPr>
-                              <w:rFonts w:ascii="Tahoma" w:hAnsi="Tahoma" w:cs="Tahoma"/>
-                              <w:sz w:val="16"/>
-                              <w:szCs w:val="16"/>
-                            </w:rPr>
-                            <w:t xml:space="preserve">, P.S: </w:t>
-                          </w:r>
-                          <w:proofErr w:type="spellStart"/>
-                          <w:r>
-                            <w:rPr>
-                              <w:rFonts w:ascii="Tahoma" w:hAnsi="Tahoma" w:cs="Tahoma"/>
-                              <w:sz w:val="16"/>
-                              <w:szCs w:val="16"/>
-                            </w:rPr>
-                            <w:t>Dhamrai</w:t>
-                          </w:r>
-                          <w:proofErr w:type="spellEnd"/>
-                          <w:r>
-                            <w:rPr>
-                              <w:rFonts w:ascii="Tahoma" w:hAnsi="Tahoma" w:cs="Tahoma"/>
-                              <w:sz w:val="16"/>
-                              <w:szCs w:val="16"/>
-                            </w:rPr>
-                            <w:t xml:space="preserve"> District: Dhaka, </w:t>
-                          </w:r>
-                          <w:proofErr w:type="spellStart"/>
-                          <w:r>
-                            <w:rPr>
-                              <w:rFonts w:ascii="Tahoma" w:hAnsi="Tahoma" w:cs="Tahoma"/>
-                              <w:sz w:val="16"/>
-                              <w:szCs w:val="16"/>
-                            </w:rPr>
-                            <w:t>Bangladesh.Web</w:t>
-                          </w:r>
-                          <w:proofErr w:type="spellEnd"/>
-                          <w:r>
-                            <w:rPr>
-                              <w:rFonts w:ascii="Tahoma" w:hAnsi="Tahoma" w:cs="Tahoma"/>
-                              <w:sz w:val="16"/>
-                              <w:szCs w:val="16"/>
-                            </w:rPr>
-                            <w:t>: www.ocl-bd.com Phone: +8809612223355</w:t>
-                          </w:r>
                         </w:p>
                       </w:txbxContent>
                     </wps:txbx>
@@ -3215,9 +3015,142 @@
         </mc:Choice>
         <mc:Fallback>
           <w:pict>
-            <v:rect w14:anchorId="1CC9E2F8" id="Rectangle 10" o:spid="_x0000_s1028" style="position:absolute;left:0;text-align:left;margin-left:666pt;margin-top:8.25pt;width:220.45pt;height:49.5pt;z-index:251659264;visibility:visible;mso-wrap-style:square;mso-width-percent:0;mso-height-percent:0;mso-wrap-distance-left:9pt;mso-wrap-distance-top:0;mso-wrap-distance-right:9pt;mso-wrap-distance-bottom:0;mso-position-horizontal:absolute;mso-position-horizontal-relative:text;mso-position-vertical:absolute;mso-position-vertical-relative:text;mso-width-percent:0;mso-height-percent:0;mso-width-relative:margin;mso-height-relative:margin;v-text-anchor:middle" o:gfxdata="UEsDBBQABgAIAAAAIQC2gziS/gAAAOEBAAATAAAAW0NvbnRlbnRfVHlwZXNdLnhtbJSRQU7DMBBF&#10;90jcwfIWJU67QAgl6YK0S0CoHGBkTxKLZGx5TGhvj5O2G0SRWNoz/78nu9wcxkFMGNg6quQqL6RA&#10;0s5Y6ir5vt9lD1JwBDIwOMJKHpHlpr69KfdHjyxSmriSfYz+USnWPY7AufNIadK6MEJMx9ApD/oD&#10;OlTrorhX2lFEilmcO2RdNtjC5xDF9pCuTyYBB5bi6bQ4syoJ3g9WQ0ymaiLzg5KdCXlKLjvcW893&#10;SUOqXwnz5DrgnHtJTxOsQfEKIT7DmDSUCaxw7Rqn8787ZsmRM9e2VmPeBN4uqYvTtW7jvijg9N/y&#10;JsXecLq0q+WD6m8AAAD//wMAUEsDBBQABgAIAAAAIQA4/SH/1gAAAJQBAAALAAAAX3JlbHMvLnJl&#10;bHOkkMFqwzAMhu+DvYPRfXGawxijTi+j0GvpHsDYimMaW0Yy2fr2M4PBMnrbUb/Q94l/f/hMi1qR&#10;JVI2sOt6UJgd+ZiDgffL8ekFlFSbvV0oo4EbChzGx4f9GRdb25HMsYhqlCwG5lrLq9biZkxWOiqY&#10;22YiTra2kYMu1l1tQD30/bPm3wwYN0x18gb45AdQl1tp5j/sFB2T0FQ7R0nTNEV3j6o9feQzro1i&#10;OWA14Fm+Q8a1a8+Bvu/d/dMb2JY5uiPbhG/ktn4cqGU/er3pcvwCAAD//wMAUEsDBBQABgAIAAAA&#10;IQCZow8fhQIAAF8FAAAOAAAAZHJzL2Uyb0RvYy54bWysVEtvGyEQvlfqf0Dcm/Vadh5W1pHlKFWl&#10;KImSVDljFmxUYChg77q/vgO73ripT1UvLLPz/vhmrm9ao8lO+KDAVrQ8G1EiLIda2XVFv7/efbmk&#10;JERma6bBioruRaA388+frhs3E2PYgK6FJxjEhlnjKrqJ0c2KIvCNMCycgRMWlRK8YRFFvy5qzxqM&#10;bnQxHo3OiwZ87TxwEQL+ve2UdJ7jSyl4fJQyiEh0RbG2mE+fz1U6i/k1m609cxvF+zLYP1RhmLKY&#10;dAh1yyIjW6/+CmUU9xBAxjMOpgApFRe5B+ymHH3o5mXDnMi9IDjBDTCF/xeWP+yePFE1vh3CY5nB&#10;N3pG1Jhda0HwHwLUuDBDuxf35Hsp4DV120pv0hf7IG0GdT+AKtpIOP4cX1xdXZRTSjjqzseX59Mc&#10;tHj3dj7ErwIMSZeKekyfsWS7+xAxI5oeTFIybdMZQKv6TmmdhUQXsdSe7Bg+9GpdprrR78gKpeRZ&#10;pG66+vMt7rXooj4LiUCkinP2TMH3mIxzYeO0j6stWic3iRUMjuUpRx0PxfS2yU1kag6Oo1OOf2Yc&#10;PHJWsHFwNsqCPxWg/jFk7uwP3Xc9p/Zju2r7N11BvUcqeOhmJDh+p/A97lmIT8zjUCA/cNDjIx5S&#10;Q1NR6G+UbMD/OvU/2SNXUUtJg0NW0fBzy7ygRH+zyOKrcjJJU5mFyfRijII/1qyONXZrloDPW+JK&#10;cTxfk33Uh6v0YN5wHyxSVlQxyzF3RXn0B2EZu+HHjcLFYpHNcBIdi/f2xfEUPAGc+PbavjHvelJG&#10;pPMDHAaSzT5ws7NNnhYW2whSZeImiDtce+hxijMv+42T1sSxnK3e9+L8NwAAAP//AwBQSwMEFAAG&#10;AAgAAAAhAMiMS23eAAAADAEAAA8AAABkcnMvZG93bnJldi54bWxMj8FOwzAQRO9I/IO1SNyoE1dp&#10;IY1TRSAkrmm5cHNjN4mw16nttuHv2Z7gNqMdzb6ptrOz7GJCHD1KyBcZMIOd1yP2Ej7370/PwGJS&#10;qJX1aCT8mAjb+v6uUqX2V2zNZZd6RiUYSyVhSGkqOY/dYJyKCz8ZpNvRB6cS2dBzHdSVyp3lIstW&#10;3KkR6cOgJvM6mO57d3YS3myTf/kTNuojtad+DKKdg5Dy8WFuNsCSmdNfGG74hA41MR38GXVklvxy&#10;KWhMIrUqgN0S67V4AXYglRcF8Lri/0fUvwAAAP//AwBQSwECLQAUAAYACAAAACEAtoM4kv4AAADh&#10;AQAAEwAAAAAAAAAAAAAAAAAAAAAAW0NvbnRlbnRfVHlwZXNdLnhtbFBLAQItABQABgAIAAAAIQA4&#10;/SH/1gAAAJQBAAALAAAAAAAAAAAAAAAAAC8BAABfcmVscy8ucmVsc1BLAQItABQABgAIAAAAIQCZ&#10;ow8fhQIAAF8FAAAOAAAAAAAAAAAAAAAAAC4CAABkcnMvZTJvRG9jLnhtbFBLAQItABQABgAIAAAA&#10;IQDIjEtt3gAAAAwBAAAPAAAAAAAAAAAAAAAAAN8EAABkcnMvZG93bnJldi54bWxQSwUGAAAAAAQA&#10;BADzAAAA6gUAAAAA&#10;" fillcolor="white [3201]" strokecolor="white [3212]" strokeweight="1pt">
+            <v:rect w14:anchorId="21FD6A98" id="Rectangle 8" o:spid="_x0000_s1028" style="position:absolute;margin-left:701.4pt;margin-top:10.1pt;width:179.4pt;height:67.1pt;z-index:251661312;visibility:visible;mso-wrap-style:square;mso-width-percent:0;mso-height-percent:0;mso-wrap-distance-left:9pt;mso-wrap-distance-top:0;mso-wrap-distance-right:9pt;mso-wrap-distance-bottom:0;mso-position-horizontal:absolute;mso-position-horizontal-relative:text;mso-position-vertical:absolute;mso-position-vertical-relative:text;mso-width-percent:0;mso-height-percent:0;mso-width-relative:margin;mso-height-relative:margin;v-text-anchor:middle" o:gfxdata="UEsDBBQABgAIAAAAIQC2gziS/gAAAOEBAAATAAAAW0NvbnRlbnRfVHlwZXNdLnhtbJSRQU7DMBBF&#10;90jcwfIWJU67QAgl6YK0S0CoHGBkTxKLZGx5TGhvj5O2G0SRWNoz/78nu9wcxkFMGNg6quQqL6RA&#10;0s5Y6ir5vt9lD1JwBDIwOMJKHpHlpr69KfdHjyxSmriSfYz+USnWPY7AufNIadK6MEJMx9ApD/oD&#10;OlTrorhX2lFEilmcO2RdNtjC5xDF9pCuTyYBB5bi6bQ4syoJ3g9WQ0ymaiLzg5KdCXlKLjvcW893&#10;SUOqXwnz5DrgnHtJTxOsQfEKIT7DmDSUCaxw7Rqn8787ZsmRM9e2VmPeBN4uqYvTtW7jvijg9N/y&#10;JsXecLq0q+WD6m8AAAD//wMAUEsDBBQABgAIAAAAIQA4/SH/1gAAAJQBAAALAAAAX3JlbHMvLnJl&#10;bHOkkMFqwzAMhu+DvYPRfXGawxijTi+j0GvpHsDYimMaW0Yy2fr2M4PBMnrbUb/Q94l/f/hMi1qR&#10;JVI2sOt6UJgd+ZiDgffL8ekFlFSbvV0oo4EbChzGx4f9GRdb25HMsYhqlCwG5lrLq9biZkxWOiqY&#10;22YiTra2kYMu1l1tQD30/bPm3wwYN0x18gb45AdQl1tp5j/sFB2T0FQ7R0nTNEV3j6o9feQzro1i&#10;OWA14Fm+Q8a1a8+Bvu/d/dMb2JY5uiPbhG/ktn4cqGU/er3pcvwCAAD//wMAUEsDBBQABgAIAAAA&#10;IQBASkHogQIAAF0FAAAOAAAAZHJzL2Uyb0RvYy54bWysVEtvGjEQvlfqf7B8bxYoNARliRARVaUo&#10;iZJUORuvDVZtj2sbdumv79i7bGjKqerFO7Pz/uZxfdMYTfbCBwW2pMOLASXCcqiU3ZT0+8vq05SS&#10;EJmtmAYrSnoQgd7MP364rt1MjGALuhKeoBMbZrUr6TZGNyuKwLfCsHABTlgUSvCGRWT9pqg8q9G7&#10;0cVoMPhS1OAr54GLEPDvbSuk8+xfSsHjg5RBRKJLirnF/Pr8rtNbzK/ZbOOZ2yrepcH+IQvDlMWg&#10;vatbFhnZefWXK6O4hwAyXnAwBUipuMg1YDXDwbtqnrfMiVwLghNcD1P4f275/f7RE1WVFBtlmcEW&#10;PSFozG60INMET+3CDLWe3aPvuIBkqrWR3qQvVkGaDOmhh1Q0kXD8ORpdTj9PEXmOsulkNJiMk9Pi&#10;zdr5EL8KMCQRJfUYPSPJ9nchtqpHlRRM2/QG0KpaKa0zk4ZFLLUne4ZtXm+GXYgTLQyYLItUTZt/&#10;puJBi9brk5AIQ8o4R88D+OaTcS5snHR+tUXtZCYxg95weM5Qx2MynW4yE3kwe8PBOcM/I/YWOSrY&#10;2BsbZcGfc1D96CO3+sfq25pT+bFZN11P11AdcBA8tBsSHF8p7McdC/GReVwJbCGueXzAR2qoSwod&#10;RckW/K9z/5M+TipKKalxxUoafu6YF5TobxZn+Go4HqedzMx4cjlCxp9K1qcSuzNLwPYO8aA4nsmk&#10;H/WRlB7MK16DRYqKImY5xi4pj/7ILGO7+nhPuFgsshruoWPxzj47npwngNO8vTSvzLtuKCOO8z0c&#10;15HN3s1mq5ssLSx2EaTKg5sgbnHtoMcdzqPf3Zt0JE75rPV2Fee/AQAA//8DAFBLAwQUAAYACAAA&#10;ACEAJPZMCd0AAAAMAQAADwAAAGRycy9kb3ducmV2LnhtbEyPwU7DMBBE70j8g7VI3KgdKwQU4lQR&#10;CIlrChdu29gkEfY6td02/D3uCW4zmtHs22a7OstOJsTZk4JiI4AZGryeaVTw8f569wgsJiSN1pNR&#10;8GMibNvrqwZr7c/Um9MujSyPUKxRwZTSUnMeh8k4jBu/GMrZlw8OU7Zh5DrgOY87y6UQFXc4U74w&#10;4WKeJzN8745OwYvtik9/oA7fUn8Y5yD7NUilbm/W7glYMmv6K8MFP6NDm5n2/kg6Mpt9KWRmTwqk&#10;kMAujYeqqIDts7ovS+Btw/8/0f4CAAD//wMAUEsBAi0AFAAGAAgAAAAhALaDOJL+AAAA4QEAABMA&#10;AAAAAAAAAAAAAAAAAAAAAFtDb250ZW50X1R5cGVzXS54bWxQSwECLQAUAAYACAAAACEAOP0h/9YA&#10;AACUAQAACwAAAAAAAAAAAAAAAAAvAQAAX3JlbHMvLnJlbHNQSwECLQAUAAYACAAAACEAQEpB6IEC&#10;AABdBQAADgAAAAAAAAAAAAAAAAAuAgAAZHJzL2Uyb0RvYy54bWxQSwECLQAUAAYACAAAACEAJPZM&#10;Cd0AAAAMAQAADwAAAAAAAAAAAAAAAADbBAAAZHJzL2Rvd25yZXYueG1sUEsFBgAAAAAEAAQA8wAA&#10;AOUFAAAAAA==&#10;" fillcolor="white [3201]" strokecolor="white [3212]" strokeweight="1pt">
               <v:textbox>
                 <w:txbxContent>
+                  <w:p>
+                    <w:pPr>
+                      <w:shd w:val="clear" w:color="auto" w:fill="FFFFFF"/>
+                      <w:jc w:val="right"/>
+                      <w:rPr>
+                        <w:rFonts w:ascii="Tahoma" w:eastAsia="Times New Roman" w:hAnsi="Tahoma" w:cs="Tahoma"/>
+                        <w:sz w:val="16"/>
+                        <w:szCs w:val="16"/>
+                      </w:rPr>
+                    </w:pPr>
+                    <w:r>
+                      <w:rPr>
+                        <w:rFonts w:ascii="Tahoma" w:eastAsia="Times New Roman" w:hAnsi="Tahoma" w:cs="Tahoma"/>
+                        <w:sz w:val="16"/>
+                        <w:szCs w:val="16"/>
+                      </w:rPr>
+                      <w:t>701, NRK Business Park, Vijay Nagar Square,</w:t>
+                    </w:r>
+                  </w:p>
+                  <w:p>
+                    <w:pPr>
+                      <w:shd w:val="clear" w:color="auto" w:fill="FFFFFF"/>
+                      <w:jc w:val="right"/>
+                      <w:rPr>
+                        <w:rFonts w:ascii="Tahoma" w:eastAsia="Times New Roman" w:hAnsi="Tahoma" w:cs="Tahoma"/>
+                        <w:sz w:val="16"/>
+                        <w:szCs w:val="16"/>
+                      </w:rPr>
+                    </w:pPr>
+                    <w:r>
+                      <w:rPr>
+                        <w:rFonts w:ascii="Tahoma" w:eastAsia="Times New Roman" w:hAnsi="Tahoma" w:cs="Tahoma"/>
+                        <w:sz w:val="16"/>
+                        <w:szCs w:val="16"/>
+                      </w:rPr>
+                      <w:t>Indore – 452010, Madhya Pradesh, India.</w:t>
+                    </w:r>
+                  </w:p>
+                  <w:p>
+                    <w:pPr>
+                      <w:shd w:val="clear" w:color="auto" w:fill="FFFFFF"/>
+                      <w:jc w:val="right"/>
+                      <w:rPr>
+                        <w:rFonts w:ascii="Tahoma" w:eastAsia="Times New Roman" w:hAnsi="Tahoma" w:cs="Tahoma"/>
+                        <w:sz w:val="16"/>
+                        <w:szCs w:val="16"/>
+                      </w:rPr>
+                    </w:pPr>
+                    <w:hyperlink r:id="rId3" w:tgtFrame="_blank" w:history="1">
+                      <w:r>
+                        <w:rPr>
+                          <w:rFonts w:ascii="Tahoma" w:eastAsia="Times New Roman" w:hAnsi="Tahoma" w:cs="Tahoma"/>
+                          <w:sz w:val="16"/>
+                          <w:szCs w:val="16"/>
+                        </w:rPr>
+                        <w:t>Tel: +91-731-4267900</w:t>
+                      </w:r>
+                    </w:hyperlink>
+                    <w:r>
+                      <w:rPr>
+                        <w:rFonts w:ascii="Tahoma" w:eastAsia="Times New Roman" w:hAnsi="Tahoma" w:cs="Tahoma"/>
+                        <w:sz w:val="16"/>
+                        <w:szCs w:val="16"/>
+                      </w:rPr>
+                      <w:t xml:space="preserve"> / 01</w:t>
+                    </w:r>
+                  </w:p>
+                  <w:p>
+                    <w:pPr>
+                      <w:shd w:val="clear" w:color="auto" w:fill="FFFFFF"/>
+                      <w:jc w:val="right"/>
+                      <w:rPr>
+                        <w:rFonts w:ascii="Tahoma" w:eastAsia="Times New Roman" w:hAnsi="Tahoma" w:cs="Tahoma"/>
+                        <w:color w:val="222222"/>
+                        <w:sz w:val="16"/>
+                        <w:szCs w:val="16"/>
+                      </w:rPr>
+                    </w:pPr>
+                    <w:r>
+                      <w:rPr>
+                        <w:rFonts w:ascii="Tahoma" w:eastAsia="Times New Roman" w:hAnsi="Tahoma" w:cs="Tahoma"/>
+                        <w:color w:val="222222"/>
+                        <w:sz w:val="16"/>
+                        <w:szCs w:val="16"/>
+                      </w:rPr>
+                      <w:t xml:space="preserve">Email: </w:t>
+                    </w:r>
+                    <w:r>
+                      <w:rPr>
+                        <w:rFonts w:ascii="Tahoma" w:eastAsia="Times New Roman" w:hAnsi="Tahoma" w:cs="Tahoma"/>
+                        <w:i/>
+                        <w:iCs/>
+                        <w:color w:val="4472C4" w:themeColor="accent1"/>
+                        <w:sz w:val="16"/>
+                        <w:szCs w:val="16"/>
+                      </w:rPr>
+                      <w:t>info@vasudhaswaraj.com</w:t>
+                    </w:r>
+                  </w:p>
+                  <w:p>
+                    <w:pPr>
+                      <w:shd w:val="clear" w:color="auto" w:fill="FFFFFF"/>
+                      <w:jc w:val="right"/>
+                      <w:rPr>
+                        <w:rFonts w:ascii="Tahoma" w:eastAsia="Times New Roman" w:hAnsi="Tahoma" w:cs="Tahoma"/>
+                        <w:color w:val="222222"/>
+                        <w:sz w:val="16"/>
+                        <w:szCs w:val="16"/>
+                      </w:rPr>
+                    </w:pPr>
+                    <w:r>
+                      <w:rPr>
+                        <w:rFonts w:ascii="Tahoma" w:eastAsia="Times New Roman" w:hAnsi="Tahoma" w:cs="Tahoma"/>
+                        <w:sz w:val="16"/>
+                        <w:szCs w:val="16"/>
+                      </w:rPr>
+                      <w:t>Website:</w:t>
+                    </w:r>
+                    <w:hyperlink r:id="rId4" w:history="1">
+                      <w:r>
+                        <w:rPr>
+                          <w:rStyle w:val="Hyperlink"/>
+                          <w:rFonts w:ascii="Tahoma" w:eastAsia="Times New Roman" w:hAnsi="Tahoma" w:cs="Tahoma"/>
+                          <w:i/>
+                          <w:iCs/>
+                          <w:sz w:val="16"/>
+                          <w:szCs w:val="16"/>
+                          <w:u w:val="none"/>
+                        </w:rPr>
+                        <w:t>www.vasudhaswaraj.com</w:t>
+                      </w:r>
+                    </w:hyperlink>
+                  </w:p>
                   <w:p>
                     <w:pPr>
                       <w:jc w:val="right"/>
@@ -3227,122 +3160,6 @@
                         <w:szCs w:val="16"/>
                       </w:rPr>
                     </w:pPr>
-                    <w:r>
-                      <w:rPr>
-                        <w:rFonts w:ascii="Tahoma" w:hAnsi="Tahoma" w:cs="Tahoma"/>
-                        <w:sz w:val="16"/>
-                        <w:szCs w:val="16"/>
-                      </w:rPr>
-                      <w:t xml:space="preserve">Mouza: </w:t>
-                    </w:r>
-                    <w:proofErr w:type="spellStart"/>
-                    <w:r>
-                      <w:rPr>
-                        <w:rFonts w:ascii="Tahoma" w:hAnsi="Tahoma" w:cs="Tahoma"/>
-                        <w:sz w:val="16"/>
-                        <w:szCs w:val="16"/>
-                      </w:rPr>
-                      <w:t>Depashai</w:t>
-                    </w:r>
-                    <w:proofErr w:type="spellEnd"/>
-                    <w:r>
-                      <w:rPr>
-                        <w:rFonts w:ascii="Tahoma" w:hAnsi="Tahoma" w:cs="Tahoma"/>
-                        <w:sz w:val="16"/>
-                        <w:szCs w:val="16"/>
-                      </w:rPr>
-                      <w:t xml:space="preserve">, </w:t>
-                    </w:r>
-                    <w:proofErr w:type="gramStart"/>
-                    <w:r>
-                      <w:rPr>
-                        <w:rFonts w:ascii="Tahoma" w:hAnsi="Tahoma" w:cs="Tahoma"/>
-                        <w:sz w:val="16"/>
-                        <w:szCs w:val="16"/>
-                      </w:rPr>
-                      <w:t>U.P</w:t>
-                    </w:r>
-                    <w:proofErr w:type="gramEnd"/>
-                    <w:r>
-                      <w:rPr>
-                        <w:rFonts w:ascii="Tahoma" w:hAnsi="Tahoma" w:cs="Tahoma"/>
-                        <w:sz w:val="16"/>
-                        <w:szCs w:val="16"/>
-                      </w:rPr>
-                      <w:t xml:space="preserve">: </w:t>
-                    </w:r>
-                    <w:proofErr w:type="spellStart"/>
-                    <w:r>
-                      <w:rPr>
-                        <w:rFonts w:ascii="Tahoma" w:hAnsi="Tahoma" w:cs="Tahoma"/>
-                        <w:sz w:val="16"/>
-                        <w:szCs w:val="16"/>
-                      </w:rPr>
-                      <w:t>Sombag</w:t>
-                    </w:r>
-                    <w:proofErr w:type="spellEnd"/>
-                    <w:r>
-                      <w:rPr>
-                        <w:rFonts w:ascii="Tahoma" w:hAnsi="Tahoma" w:cs="Tahoma"/>
-                        <w:sz w:val="16"/>
-                        <w:szCs w:val="16"/>
-                      </w:rPr>
-                      <w:t xml:space="preserve">, </w:t>
-                    </w:r>
-                    <w:proofErr w:type="spellStart"/>
-                    <w:r>
-                      <w:rPr>
-                        <w:rFonts w:ascii="Tahoma" w:hAnsi="Tahoma" w:cs="Tahoma"/>
-                        <w:sz w:val="16"/>
-                        <w:szCs w:val="16"/>
-                      </w:rPr>
-                      <w:t>Kalampur</w:t>
-                    </w:r>
-                    <w:proofErr w:type="spellEnd"/>
-                    <w:r>
-                      <w:rPr>
-                        <w:rFonts w:ascii="Tahoma" w:hAnsi="Tahoma" w:cs="Tahoma"/>
-                        <w:sz w:val="16"/>
-                        <w:szCs w:val="16"/>
-                      </w:rPr>
-                      <w:t xml:space="preserve">, P.S: </w:t>
-                    </w:r>
-                    <w:proofErr w:type="spellStart"/>
-                    <w:r>
-                      <w:rPr>
-                        <w:rFonts w:ascii="Tahoma" w:hAnsi="Tahoma" w:cs="Tahoma"/>
-                        <w:sz w:val="16"/>
-                        <w:szCs w:val="16"/>
-                      </w:rPr>
-                      <w:t>Dhamrai</w:t>
-                    </w:r>
-                    <w:proofErr w:type="spellEnd"/>
-                    <w:r>
-                      <w:rPr>
-                        <w:rFonts w:ascii="Tahoma" w:hAnsi="Tahoma" w:cs="Tahoma"/>
-                        <w:sz w:val="16"/>
-                        <w:szCs w:val="16"/>
-                      </w:rPr>
-                      <w:t xml:space="preserve"> District: Dhaka, </w:t>
-                    </w:r>
-                    <w:proofErr w:type="spellStart"/>
-                    <w:r>
-                      <w:rPr>
-                        <w:rFonts w:ascii="Tahoma" w:hAnsi="Tahoma" w:cs="Tahoma"/>
-                        <w:sz w:val="16"/>
-                        <w:szCs w:val="16"/>
-                      </w:rPr>
-                      <w:t>Bangladesh.Web</w:t>
-                    </w:r>
-                    <w:proofErr w:type="spellEnd"/>
-                    <w:r>
-                      <w:rPr>
-                        <w:rFonts w:ascii="Tahoma" w:hAnsi="Tahoma" w:cs="Tahoma"/>
-                        <w:sz w:val="16"/>
-                        <w:szCs w:val="16"/>
-                      </w:rPr>
-                      <w:t>: www.ocl-bd.com Phone: +8809612223355</w:t>
-                    </w:r>
                   </w:p>
                 </w:txbxContent>
               </v:textbox>
@@ -3350,6 +3167,95 @@
           </w:pict>
         </mc:Fallback>
       </mc:AlternateContent>
+    </w:r>
+    <w:r>
+      <w:rPr>
+        <w:noProof/>
+      </w:rPr>
+      <w:drawing>
+        <wp:anchor distT="0" distB="0" distL="114300" distR="114300" simplePos="0" relativeHeight="251657216" behindDoc="1" locked="0" layoutInCell="1" allowOverlap="1" wp14:anchorId="19807D68" wp14:editId="7157BBB2">
+          <wp:simplePos x="0" y="0"/>
+          <wp:positionH relativeFrom="column">
+            <wp:posOffset>-173182</wp:posOffset>
+          </wp:positionH>
+          <wp:positionV relativeFrom="paragraph">
+            <wp:posOffset>111009</wp:posOffset>
+          </wp:positionV>
+          <wp:extent cx="1873885" cy="567690"/>
+          <wp:effectExtent l="0" t="0" r="0" b="3810"/>
+          <wp:wrapTight wrapText="bothSides">
+            <wp:wrapPolygon edited="0">
+              <wp:start x="1757" y="0"/>
+              <wp:lineTo x="0" y="4349"/>
+              <wp:lineTo x="0" y="17396"/>
+              <wp:lineTo x="1757" y="21020"/>
+              <wp:lineTo x="3733" y="21020"/>
+              <wp:lineTo x="21300" y="17396"/>
+              <wp:lineTo x="21300" y="7973"/>
+              <wp:lineTo x="12956" y="2174"/>
+              <wp:lineTo x="3953" y="0"/>
+              <wp:lineTo x="1757" y="0"/>
+            </wp:wrapPolygon>
+          </wp:wrapTight>
+          <wp:docPr id="7" name="Picture 7"/>
+          <wp:cNvGraphicFramePr>
+            <a:graphicFrameLocks xmlns:a="http://schemas.openxmlformats.org/drawingml/2006/main" noChangeAspect="1"/>
+          </wp:cNvGraphicFramePr>
+          <a:graphic xmlns:a="http://schemas.openxmlformats.org/drawingml/2006/main">
+            <a:graphicData uri="http://schemas.openxmlformats.org/drawingml/2006/picture">
+              <pic:pic xmlns:pic="http://schemas.openxmlformats.org/drawingml/2006/picture">
+                <pic:nvPicPr>
+                  <pic:cNvPr id="0" name="Picture 1"/>
+                  <pic:cNvPicPr>
+                    <a:picLocks noChangeAspect="1" noChangeArrowheads="1"/>
+                  </pic:cNvPicPr>
+                </pic:nvPicPr>
+                <pic:blipFill>
+                  <a:blip r:embed="rId5">
+                    <a:extLst>
+                      <a:ext uri="{28A0092B-C50C-407E-A947-70E740481C1C}">
+                        <a14:useLocalDpi xmlns:a14="http://schemas.microsoft.com/office/drawing/2010/main" val="0"/>
+                      </a:ext>
+                    </a:extLst>
+                  </a:blip>
+                  <a:srcRect/>
+                  <a:stretch>
+                    <a:fillRect/>
+                  </a:stretch>
+                </pic:blipFill>
+                <pic:spPr bwMode="auto">
+                  <a:xfrm>
+                    <a:off x="0" y="0"/>
+                    <a:ext cx="1873885" cy="567690"/>
+                  </a:xfrm>
+                  <a:prstGeom prst="rect">
+                    <a:avLst/>
+                  </a:prstGeom>
+                  <a:noFill/>
+                  <a:ln>
+                    <a:noFill/>
+                  </a:ln>
+                </pic:spPr>
+              </pic:pic>
+            </a:graphicData>
+          </a:graphic>
+          <wp14:sizeRelH relativeFrom="margin">
+            <wp14:pctWidth>0</wp14:pctWidth>
+          </wp14:sizeRelH>
+          <wp14:sizeRelV relativeFrom="margin">
+            <wp14:pctHeight>0</wp14:pctHeight>
+          </wp14:sizeRelV>
+        </wp:anchor>
+      </w:drawing>
+    </w:r>
+    <w:r>
+      <w:tab/>
+    </w:r>
+    <w:r>
+      <w:tab/>
+    </w:r>
+    <w:r>
+      <w:tab/>
     </w:r>
   </w:p>
   <w:p>
@@ -3362,55 +3268,156 @@
     </w:pPr>
     <w:r>
       <w:rPr>
-        <w:rFonts w:ascii="Arial Narrow" w:eastAsia="Arial" w:hAnsi="Arial Narrow" w:cs="Arial"/>
-        <w:b/>
-        <w:bCs/>
         <w:noProof/>
-        <w:color w:val="000000" w:themeColor="text1"/>
-        <w:sz w:val="23"/>
-        <w:szCs w:val="23"/>
       </w:rPr>
-      <w:drawing>
-        <wp:inline distT="0" distB="0" distL="0" distR="0" wp14:anchorId="1A36DE1F" wp14:editId="3A76BF69">
-          <wp:extent cx="1828800" cy="629406"/>
-          <wp:effectExtent l="0" t="0" r="0" b="0"/>
-          <wp:docPr id="7" name="Picture 7"/>
-          <wp:cNvGraphicFramePr>
-            <a:graphicFrameLocks xmlns:a="http://schemas.openxmlformats.org/drawingml/2006/main" noChangeAspect="1"/>
-          </wp:cNvGraphicFramePr>
-          <a:graphic xmlns:a="http://schemas.openxmlformats.org/drawingml/2006/main">
-            <a:graphicData uri="http://schemas.openxmlformats.org/drawingml/2006/picture">
-              <pic:pic xmlns:pic="http://schemas.openxmlformats.org/drawingml/2006/picture">
-                <pic:nvPicPr>
-                  <pic:cNvPr id="0" name="LOGO - TM well.jpg"/>
-                  <pic:cNvPicPr/>
-                </pic:nvPicPr>
-                <pic:blipFill>
-                  <a:blip r:embed="rId1">
-                    <a:extLst>
-                      <a:ext uri="{28A0092B-C50C-407E-A947-70E740481C1C}">
-                        <a14:useLocalDpi xmlns:a14="http://schemas.microsoft.com/office/drawing/2010/main" val="0"/>
-                      </a:ext>
-                    </a:extLst>
-                  </a:blip>
-                  <a:stretch>
-                    <a:fillRect/>
-                  </a:stretch>
-                </pic:blipFill>
-                <pic:spPr>
-                  <a:xfrm>
-                    <a:off x="0" y="0"/>
-                    <a:ext cx="1830400" cy="629957"/>
-                  </a:xfrm>
-                  <a:prstGeom prst="rect">
-                    <a:avLst/>
-                  </a:prstGeom>
-                </pic:spPr>
-              </pic:pic>
-            </a:graphicData>
-          </a:graphic>
-        </wp:inline>
-      </w:drawing>
+      <mc:AlternateContent>
+        <mc:Choice Requires="wps">
+          <w:drawing>
+            <wp:anchor distT="0" distB="0" distL="114300" distR="114300" simplePos="0" relativeHeight="251658240" behindDoc="1" locked="0" layoutInCell="1" allowOverlap="1" wp14:anchorId="4DC88F5A" wp14:editId="22305AEB">
+              <wp:simplePos x="0" y="0"/>
+              <wp:positionH relativeFrom="column">
+                <wp:posOffset>-193963</wp:posOffset>
+              </wp:positionH>
+              <wp:positionV relativeFrom="paragraph">
+                <wp:posOffset>650644</wp:posOffset>
+              </wp:positionV>
+              <wp:extent cx="1496060" cy="248920"/>
+              <wp:effectExtent l="0" t="0" r="27940" b="17780"/>
+              <wp:wrapTight wrapText="bothSides">
+                <wp:wrapPolygon edited="0">
+                  <wp:start x="0" y="0"/>
+                  <wp:lineTo x="0" y="21490"/>
+                  <wp:lineTo x="21728" y="21490"/>
+                  <wp:lineTo x="21728" y="0"/>
+                  <wp:lineTo x="0" y="0"/>
+                </wp:wrapPolygon>
+              </wp:wrapTight>
+              <wp:docPr id="11" name="Rectangle 11"/>
+              <wp:cNvGraphicFramePr/>
+              <a:graphic xmlns:a="http://schemas.openxmlformats.org/drawingml/2006/main">
+                <a:graphicData uri="http://schemas.microsoft.com/office/word/2010/wordprocessingShape">
+                  <wps:wsp>
+                    <wps:cNvSpPr/>
+                    <wps:spPr>
+                      <a:xfrm>
+                        <a:off x="0" y="0"/>
+                        <a:ext cx="1496060" cy="248920"/>
+                      </a:xfrm>
+                      <a:prstGeom prst="rect">
+                        <a:avLst/>
+                      </a:prstGeom>
+                      <a:ln>
+                        <a:solidFill>
+                          <a:schemeClr val="bg1"/>
+                        </a:solidFill>
+                      </a:ln>
+                    </wps:spPr>
+                    <wps:style>
+                      <a:lnRef idx="2">
+                        <a:schemeClr val="accent5"/>
+                      </a:lnRef>
+                      <a:fillRef idx="1">
+                        <a:schemeClr val="lt1"/>
+                      </a:fillRef>
+                      <a:effectRef idx="0">
+                        <a:schemeClr val="accent5"/>
+                      </a:effectRef>
+                      <a:fontRef idx="minor">
+                        <a:schemeClr val="dk1"/>
+                      </a:fontRef>
+                    </wps:style>
+                    <wps:txbx>
+                      <w:txbxContent>
+                        <w:p>
+                          <w:r>
+                            <w:rPr>
+                              <w:rFonts w:ascii="Tahoma" w:hAnsi="Tahoma" w:cs="Tahoma"/>
+                              <w:b/>
+                              <w:bCs/>
+                              <w:sz w:val="16"/>
+                              <w:szCs w:val="16"/>
+                              <w:shd w:val="clear" w:color="auto" w:fill="FFFFFF"/>
+                            </w:rPr>
+                            <w:t>Vasudha Swaraj</w:t>
+                          </w:r>
+                          <w:r>
+                            <w:rPr>
+                              <w:rFonts w:ascii="Tahoma" w:hAnsi="Tahoma" w:cs="Tahoma"/>
+                              <w:b/>
+                              <w:bCs/>
+                              <w:sz w:val="16"/>
+                              <w:szCs w:val="16"/>
+                              <w:shd w:val="clear" w:color="auto" w:fill="FFFFFF"/>
+                            </w:rPr>
+                            <w:t xml:space="preserve"> Pvt. Ltd.</w:t>
+                          </w:r>
+                        </w:p>
+                        <w:p>
+                          <w:pPr>
+                            <w:jc w:val="center"/>
+                          </w:pPr>
+                        </w:p>
+                      </w:txbxContent>
+                    </wps:txbx>
+                    <wps:bodyPr rot="0" spcFirstLastPara="0" vertOverflow="overflow" horzOverflow="overflow" vert="horz" wrap="square" lIns="91440" tIns="45720" rIns="91440" bIns="45720" numCol="1" spcCol="0" rtlCol="0" fromWordArt="0" anchor="ctr" anchorCtr="0" forceAA="0" compatLnSpc="1">
+                      <a:prstTxWarp prst="textNoShape">
+                        <a:avLst/>
+                      </a:prstTxWarp>
+                      <a:noAutofit/>
+                    </wps:bodyPr>
+                  </wps:wsp>
+                </a:graphicData>
+              </a:graphic>
+              <wp14:sizeRelH relativeFrom="margin">
+                <wp14:pctWidth>0</wp14:pctWidth>
+              </wp14:sizeRelH>
+              <wp14:sizeRelV relativeFrom="margin">
+                <wp14:pctHeight>0</wp14:pctHeight>
+              </wp14:sizeRelV>
+            </wp:anchor>
+          </w:drawing>
+        </mc:Choice>
+        <mc:Fallback>
+          <w:pict>
+            <v:rect w14:anchorId="4DC88F5A" id="Rectangle 11" o:spid="_x0000_s1029" style="position:absolute;left:0;text-align:left;margin-left:-15.25pt;margin-top:51.25pt;width:117.8pt;height:19.6pt;z-index:-251658240;visibility:visible;mso-wrap-style:square;mso-width-percent:0;mso-height-percent:0;mso-wrap-distance-left:9pt;mso-wrap-distance-top:0;mso-wrap-distance-right:9pt;mso-wrap-distance-bottom:0;mso-position-horizontal:absolute;mso-position-horizontal-relative:text;mso-position-vertical:absolute;mso-position-vertical-relative:text;mso-width-percent:0;mso-height-percent:0;mso-width-relative:margin;mso-height-relative:margin;v-text-anchor:middle" o:gfxdata="UEsDBBQABgAIAAAAIQC2gziS/gAAAOEBAAATAAAAW0NvbnRlbnRfVHlwZXNdLnhtbJSRQU7DMBBF&#10;90jcwfIWJU67QAgl6YK0S0CoHGBkTxKLZGx5TGhvj5O2G0SRWNoz/78nu9wcxkFMGNg6quQqL6RA&#10;0s5Y6ir5vt9lD1JwBDIwOMJKHpHlpr69KfdHjyxSmriSfYz+USnWPY7AufNIadK6MEJMx9ApD/oD&#10;OlTrorhX2lFEilmcO2RdNtjC5xDF9pCuTyYBB5bi6bQ4syoJ3g9WQ0ymaiLzg5KdCXlKLjvcW893&#10;SUOqXwnz5DrgnHtJTxOsQfEKIT7DmDSUCaxw7Rqn8787ZsmRM9e2VmPeBN4uqYvTtW7jvijg9N/y&#10;JsXecLq0q+WD6m8AAAD//wMAUEsDBBQABgAIAAAAIQA4/SH/1gAAAJQBAAALAAAAX3JlbHMvLnJl&#10;bHOkkMFqwzAMhu+DvYPRfXGawxijTi+j0GvpHsDYimMaW0Yy2fr2M4PBMnrbUb/Q94l/f/hMi1qR&#10;JVI2sOt6UJgd+ZiDgffL8ekFlFSbvV0oo4EbChzGx4f9GRdb25HMsYhqlCwG5lrLq9biZkxWOiqY&#10;22YiTra2kYMu1l1tQD30/bPm3wwYN0x18gb45AdQl1tp5j/sFB2T0FQ7R0nTNEV3j6o9feQzro1i&#10;OWA14Fm+Q8a1a8+Bvu/d/dMb2JY5uiPbhG/ktn4cqGU/er3pcvwCAAD//wMAUEsDBBQABgAIAAAA&#10;IQD3ArsKhgIAAGYFAAAOAAAAZHJzL2Uyb0RvYy54bWysVEtvGyEQvlfqf0Dcm7UtJ02srCPLkatK&#10;URLloZwxCzYqMBSwd91f34F9xE19qnphmZ33N99wfdMYTfbCBwW2pOOzESXCcqiU3ZT09WX15ZKS&#10;EJmtmAYrSnoQgd7MP3+6rt1MTGALuhKeYBAbZrUr6TZGNyuKwLfCsHAGTlhUSvCGRRT9pqg8qzG6&#10;0cVkNLooavCV88BFCPj3tlXSeY4vpeDxQcogItElxdpiPn0+1+ks5tdstvHMbRXvymD/UIVhymLS&#10;IdQti4zsvPorlFHcQwAZzziYAqRUXOQesJvx6EM3z1vmRO4FwQlugCn8v7D8fv/oiapwdmNKLDM4&#10;oydEjdmNFgT/IUC1CzO0e3aPvpMCXlO3jfQmfbEP0mRQDwOooomE48/x9OpidIHYc9RNppdXk4x6&#10;8e7tfIjfBBiSLiX1mD5jyfZ3IWJGNO1NUjJt0xlAq2qltM5CootYak/2DAe93uS60e/ICqXkWaRu&#10;2vrzLR60aKM+CYlAYMWTnD1T8D0m41zYeJ7wyJHQOrlJrGBwHJ9y1LEvprNNbiJTc3AcnXL8M+Pg&#10;kbOCjYOzURb8qQDVjyFza9933/ac2o/Nummn3w96DdUBGeGhXZXg+ErhWO5YiI/M427gJHHf4wMe&#10;UkNdUuhulGzB/zr1P9kjZVFLSY27VtLwc8e8oER/t0jmq/F0mpYzC9Pzr8gQ4o8162ON3Zkl4JSR&#10;r1hdvib7qPur9GDe8FlYpKyoYpZj7pLy6HthGds3AB8WLhaLbIYL6Vi8s8+Op+AJ50S7l+aNeddx&#10;MyKr76HfSzb7QNHWNnlaWOwiSJX5m5Buce0mgMucadQ9POm1OJaz1fvzOP8NAAD//wMAUEsDBBQA&#10;BgAIAAAAIQBrkg/P3QAAAAsBAAAPAAAAZHJzL2Rvd25yZXYueG1sTI9BT8MwDIXvSPyHyEjctqSF&#10;ASpNpwqExLWDCzevCW1F4nRJtpV/jznBzfZ7ev5evV28Eycb0xRIQ7FWICz1wUw0aHh/e1k9gEgZ&#10;yaALZDV82wTb5vKixsqEM3X2tMuD4BBKFWoYc54rKVM/Wo9pHWZLrH2G6DHzGgdpIp453DtZKnUn&#10;PU7EH0ac7dNo+6/d0Wt4dm3xEQ7U4mvuDsMUy26JpdbXV0v7CCLbJf+Z4Ref0aFhpn04kknCaVjd&#10;qA1bWVAlD+wo1aYAsefLbXEPsqnl/w7NDwAAAP//AwBQSwECLQAUAAYACAAAACEAtoM4kv4AAADh&#10;AQAAEwAAAAAAAAAAAAAAAAAAAAAAW0NvbnRlbnRfVHlwZXNdLnhtbFBLAQItABQABgAIAAAAIQA4&#10;/SH/1gAAAJQBAAALAAAAAAAAAAAAAAAAAC8BAABfcmVscy8ucmVsc1BLAQItABQABgAIAAAAIQD3&#10;ArsKhgIAAGYFAAAOAAAAAAAAAAAAAAAAAC4CAABkcnMvZTJvRG9jLnhtbFBLAQItABQABgAIAAAA&#10;IQBrkg/P3QAAAAsBAAAPAAAAAAAAAAAAAAAAAOAEAABkcnMvZG93bnJldi54bWxQSwUGAAAAAAQA&#10;BADzAAAA6gUAAAAA&#10;" fillcolor="white [3201]" strokecolor="white [3212]" strokeweight="1pt">
+              <v:textbox>
+                <w:txbxContent>
+                  <w:p>
+                    <w:r>
+                      <w:rPr>
+                        <w:rFonts w:ascii="Tahoma" w:hAnsi="Tahoma" w:cs="Tahoma"/>
+                        <w:b/>
+                        <w:bCs/>
+                        <w:sz w:val="16"/>
+                        <w:szCs w:val="16"/>
+                        <w:shd w:val="clear" w:color="auto" w:fill="FFFFFF"/>
+                      </w:rPr>
+                      <w:t>Vasudha Swaraj</w:t>
+                    </w:r>
+                    <w:r>
+                      <w:rPr>
+                        <w:rFonts w:ascii="Tahoma" w:hAnsi="Tahoma" w:cs="Tahoma"/>
+                        <w:b/>
+                        <w:bCs/>
+                        <w:sz w:val="16"/>
+                        <w:szCs w:val="16"/>
+                        <w:shd w:val="clear" w:color="auto" w:fill="FFFFFF"/>
+                      </w:rPr>
+                      <w:t xml:space="preserve"> Pvt. Ltd.</w:t>
+                    </w:r>
+                  </w:p>
+                  <w:p>
+                    <w:pPr>
+                      <w:jc w:val="center"/>
+                    </w:pPr>
+                  </w:p>
+                </w:txbxContent>
+              </v:textbox>
+              <w10:wrap type="tight"/>
+            </v:rect>
+          </w:pict>
+        </mc:Fallback>
+      </mc:AlternateContent>
     </w:r>
   </w:p>
   <w:p>
@@ -3422,7 +3429,7 @@
         <w:noProof/>
       </w:rPr>
       <w:drawing>
-        <wp:inline distT="0" distB="0" distL="0" distR="0" wp14:anchorId="2761CC47" wp14:editId="61CBE25A">
+        <wp:inline distT="0" distB="0" distL="0" distR="0" wp14:anchorId="341CC070" wp14:editId="4E0F6513">
           <wp:extent cx="10553700" cy="3632200"/>
           <wp:effectExtent l="19050" t="0" r="19050" b="1149350"/>
           <wp:docPr id="6" name="Picture 6"/>
@@ -3437,7 +3444,7 @@
                   <pic:cNvPicPr/>
                 </pic:nvPicPr>
                 <pic:blipFill>
-                  <a:blip r:embed="rId1">
+                  <a:blip r:embed="rId6">
                     <a:extLst>
                       <a:ext uri="{28A0092B-C50C-407E-A947-70E740481C1C}">
                         <a14:useLocalDpi xmlns:a14="http://schemas.microsoft.com/office/drawing/2010/main" val="0"/>
@@ -3488,11 +3495,6 @@
       <w:pStyle w:val="Header"/>
     </w:pPr>
   </w:p>
-</w:hdr>
-</file>
-
-<file path=word/header3.xml><?xml version="1.0" encoding="utf-8"?>
-<w:hdr xmlns:wpc="http://schemas.microsoft.com/office/word/2010/wordprocessingCanvas" xmlns:cx="http://schemas.microsoft.com/office/drawing/2014/chartex" xmlns:cx1="http://schemas.microsoft.com/office/drawing/2015/9/8/chartex" xmlns:cx2="http://schemas.microsoft.com/office/drawing/2015/10/21/chartex" xmlns:cx3="http://schemas.microsoft.com/office/drawing/2016/5/9/chartex" xmlns:cx4="http://schemas.microsoft.com/office/drawing/2016/5/10/chartex" xmlns:cx5="http://schemas.microsoft.com/office/drawing/2016/5/11/chartex" xmlns:cx6="http://schemas.microsoft.com/office/drawing/2016/5/12/chartex" xmlns:cx7="http://schemas.microsoft.com/office/drawing/2016/5/13/chartex" xmlns:cx8="http://schemas.microsoft.com/office/drawing/2016/5/14/chartex" xmlns:mc="http://schemas.openxmlformats.org/markup-compatibility/2006" xmlns:aink="http://schemas.microsoft.com/office/drawing/2016/ink" xmlns:am3d="http://schemas.microsoft.com/office/drawing/2017/model3d" xmlns:o="urn:schemas-microsoft-com:office:office" xmlns:r="http://schemas.openxmlformats.org/officeDocument/2006/relationships" xmlns:m="http://schemas.openxmlformats.org/officeDocument/2006/math" xmlns:v="urn:schemas-microsoft-com:vml" xmlns:wp14="http://schemas.microsoft.com/office/word/2010/wordprocessingDrawing" xmlns:wp="http://schemas.openxmlformats.org/drawingml/2006/wordprocessingDrawing" xmlns:w10="urn:schemas-microsoft-com:office:word" xmlns:w="http://schemas.openxmlformats.org/wordprocessingml/2006/main" xmlns:w14="http://schemas.microsoft.com/office/word/2010/wordml" xmlns:w15="http://schemas.microsoft.com/office/word/2012/wordml" xmlns:w16cex="http://schemas.microsoft.com/office/word/2018/wordml/cex" xmlns:w16cid="http://schemas.microsoft.com/office/word/2016/wordml/cid" xmlns:w16="http://schemas.microsoft.com/office/word/2018/wordml" xmlns:w16sdtdh="http://schemas.microsoft.com/office/word/2020/wordml/sdtdatahash" xmlns:w16se="http://schemas.microsoft.com/office/word/2015/wordml/symex" xmlns:wpg="http://schemas.microsoft.com/office/word/2010/wordprocessingGroup" xmlns:wpi="http://schemas.microsoft.com/office/word/2010/wordprocessingInk" xmlns:wne="http://schemas.microsoft.com/office/word/2006/wordml" xmlns:wps="http://schemas.microsoft.com/office/word/2010/wordprocessingShape" mc:Ignorable="w14 w15 w16se w16cid w16 w16cex w16sdtdh wp14">
   <w:p>
     <w:pPr>
       <w:pStyle w:val="Header"/>
@@ -3883,6 +3885,7 @@
     <w:lsdException w:name="HTML Sample" w:semiHidden="1" w:unhideWhenUsed="1"/>
     <w:lsdException w:name="HTML Typewriter" w:semiHidden="1" w:unhideWhenUsed="1"/>
     <w:lsdException w:name="HTML Variable" w:semiHidden="1" w:unhideWhenUsed="1"/>
+    <w:lsdException w:name="Normal Table" w:semiHidden="1" w:unhideWhenUsed="1"/>
     <w:lsdException w:name="annotation subject" w:semiHidden="1" w:unhideWhenUsed="1"/>
     <w:lsdException w:name="No List" w:semiHidden="1" w:unhideWhenUsed="1"/>
     <w:lsdException w:name="Outline List 1" w:semiHidden="1" w:unhideWhenUsed="1"/>
@@ -3925,8 +3928,11 @@
     <w:lsdException w:name="Table Contemporary" w:semiHidden="1" w:unhideWhenUsed="1"/>
     <w:lsdException w:name="Table Elegant" w:semiHidden="1" w:unhideWhenUsed="1"/>
     <w:lsdException w:name="Table Professional" w:semiHidden="1" w:unhideWhenUsed="1"/>
+    <w:lsdException w:name="Table Subtle 1" w:semiHidden="1" w:unhideWhenUsed="1"/>
     <w:lsdException w:name="Table Subtle 2" w:semiHidden="1" w:unhideWhenUsed="1"/>
     <w:lsdException w:name="Table Web 1" w:semiHidden="1" w:unhideWhenUsed="1"/>
+    <w:lsdException w:name="Table Web 2" w:semiHidden="1" w:unhideWhenUsed="1"/>
+    <w:lsdException w:name="Table Web 3" w:semiHidden="1" w:unhideWhenUsed="1"/>
     <w:lsdException w:name="Balloon Text" w:semiHidden="1" w:unhideWhenUsed="1"/>
     <w:lsdException w:name="Table Grid" w:uiPriority="39"/>
     <w:lsdException w:name="Table Theme" w:semiHidden="1" w:unhideWhenUsed="1"/>
@@ -4154,6 +4160,10 @@
   <w:style w:type="paragraph" w:default="1" w:styleId="Normal">
     <w:name w:val="Normal"/>
     <w:qFormat/>
+    <w:rsid w:val="00402B73"/>
+    <w:pPr>
+      <w:spacing w:after="0" w:line="240" w:lineRule="auto"/>
+    </w:pPr>
   </w:style>
   <w:style w:type="character" w:default="1" w:styleId="DefaultParagraphFont">
     <w:name w:val="Default Paragraph Font"/>
@@ -4213,7 +4223,6 @@
         <w:tab w:val="center" w:pos="4680"/>
         <w:tab w:val="right" w:pos="9360"/>
       </w:tabs>
-      <w:spacing w:after="0" w:line="240" w:lineRule="auto"/>
     </w:pPr>
   </w:style>
   <w:style w:type="character" w:customStyle="1" w:styleId="HeaderChar">
@@ -4235,7 +4244,6 @@
         <w:tab w:val="center" w:pos="4680"/>
         <w:tab w:val="right" w:pos="9360"/>
       </w:tabs>
-      <w:spacing w:after="0" w:line="240" w:lineRule="auto"/>
     </w:pPr>
   </w:style>
   <w:style w:type="character" w:customStyle="1" w:styleId="FooterChar">
@@ -4265,9 +4273,6 @@
     <w:semiHidden/>
     <w:unhideWhenUsed/>
     <w:rsid w:val="0025478F"/>
-    <w:pPr>
-      <w:spacing w:line="240" w:lineRule="auto"/>
-    </w:pPr>
     <w:rPr>
       <w:sz w:val="20"/>
       <w:szCs w:val="20"/>
@@ -4321,9 +4326,6 @@
     <w:semiHidden/>
     <w:unhideWhenUsed/>
     <w:rsid w:val="0025478F"/>
-    <w:pPr>
-      <w:spacing w:after="0" w:line="240" w:lineRule="auto"/>
-    </w:pPr>
     <w:rPr>
       <w:rFonts w:ascii="Segoe UI" w:hAnsi="Segoe UI" w:cs="Segoe UI"/>
       <w:sz w:val="18"/>
@@ -4358,6 +4360,17 @@
     <w:name w:val="lrzxr"/>
     <w:basedOn w:val="DefaultParagraphFont"/>
     <w:rsid w:val="00A8551F"/>
+  </w:style>
+  <w:style w:type="character" w:styleId="Hyperlink">
+    <w:name w:val="Hyperlink"/>
+    <w:basedOn w:val="DefaultParagraphFont"/>
+    <w:uiPriority w:val="99"/>
+    <w:unhideWhenUsed/>
+    <w:rsid w:val="00402B73"/>
+    <w:rPr>
+      <w:color w:val="0563C1" w:themeColor="hyperlink"/>
+      <w:u w:val="single"/>
+    </w:rPr>
   </w:style>
 </w:styles>
 </file>

</xml_diff>